<commit_message>
many yml templates and docxes with updated bitlys and changed conditions in dont_wait_modify_custody_divorce
</commit_message>
<xml_diff>
--- a/docassemble/AKA2JBranding/data/templates/alternate_service_content.docx
+++ b/docassemble/AKA2JBranding/data/templates/alternate_service_content.docx
@@ -7,22 +7,25 @@
         <w:pStyle w:val="Body"/>
       </w:pPr>
       <w:r>
-        <w:t>When you start a case you must give your spouse a copy of every form you file with the court. This is called “service.” If you do not know where your {{ other_party_in_case }} is, you can ask the court to let you use “alternate service."</w:t>
+        <w:t>When you start a case, you must give your spouse a copy of every form you file with the court. This is called “service.” If you do not know where your {{ other_party_in_case }} is, you can ask the court to let you use “alternate service."</w:t>
       </w:r>
     </w:p>
     <w:p>
       <w:pPr>
-        <w:pStyle w:val="Body"/>
+        <w:pStyle w:val="ListParagraph"/>
         <w:numPr>
           <w:ilvl w:val="0"/>
-          <w:numId w:val="48"/>
+          <w:numId w:val="12"/>
         </w:numPr>
-        <w:ind w:left="360"/>
-      </w:pPr>
-      <w:r>
-        <w:t xml:space="preserve">Read: </w:t>
-      </w:r>
-      <w:hyperlink r:id="rId5" w:history="1">
+        <w:ind w:left="409"/>
+      </w:pPr>
+      <w:r>
+        <w:t>Read:</w:t>
+      </w:r>
+      <w:r>
+        <w:t xml:space="preserve"> </w:t>
+      </w:r>
+      <w:hyperlink r:id="rId8" w:history="1">
         <w:r>
           <w:rPr>
             <w:rStyle w:val="Hyperlink"/>
@@ -69,66 +72,721 @@
     </w:p>
     <w:p>
       <w:pPr>
-        <w:pStyle w:val="Body"/>
+        <w:pStyle w:val="ListParagraph"/>
         <w:numPr>
           <w:ilvl w:val="0"/>
-          <w:numId w:val="48"/>
+          <w:numId w:val="12"/>
         </w:numPr>
-        <w:ind w:left="360"/>
-      </w:pPr>
-      <w:r>
-        <w:t xml:space="preserve">Review and fill out the Request to Serve Defendant by Posting or Alternative Service, and Affidavit of Diligent Inquiry, CIV-145 []. </w:t>
-      </w:r>
-      <w:hyperlink r:id="rId6" w:history="1">
+        <w:ind w:left="409"/>
+      </w:pPr>
+      <w:r>
+        <w:t>Review</w:t>
+      </w:r>
+      <w:r>
+        <w:t xml:space="preserve"> </w:t>
+      </w:r>
+      <w:r>
+        <w:t>and</w:t>
+      </w:r>
+      <w:r>
+        <w:t xml:space="preserve"> </w:t>
+      </w:r>
+      <w:r>
+        <w:t>fill</w:t>
+      </w:r>
+      <w:r>
+        <w:t xml:space="preserve"> </w:t>
+      </w:r>
+      <w:r>
+        <w:t>out</w:t>
+      </w:r>
+      <w:r>
+        <w:t xml:space="preserve"> </w:t>
+      </w:r>
+      <w:r>
+        <w:t>the</w:t>
+      </w:r>
+      <w:r>
+        <w:t xml:space="preserve"> </w:t>
+      </w:r>
+      <w:r>
+        <w:rPr>
+          <w:b/>
+          <w:bCs/>
+        </w:rPr>
+        <w:t>Request to Serve Defendant by Posting or Alternative Service, and Affidavit of Diligent Inquiry</w:t>
+      </w:r>
+      <w:r>
+        <w:t>,</w:t>
+      </w:r>
+      <w:r>
+        <w:t xml:space="preserve"> </w:t>
+      </w:r>
+      <w:r>
+        <w:rPr>
+          <w:b/>
+          <w:bCs/>
+        </w:rPr>
+        <w:t>CIV-145</w:t>
+      </w:r>
+      <w:r>
+        <w:t xml:space="preserve"> [</w:t>
+      </w:r>
+      <w:hyperlink r:id="rId9" w:history="1">
         <w:r>
           <w:rPr>
             <w:rStyle w:val="Hyperlink"/>
           </w:rPr>
-          <w:t>Fill-In PDF</w:t>
+          <w:t>Fill-in PDF</w:t>
         </w:r>
       </w:hyperlink>
+      <w:r>
+        <w:t xml:space="preserve">]. </w:t>
+      </w:r>
+      <w:r>
+        <w:br/>
+      </w:r>
+      <w:r>
+        <w:t xml:space="preserve">This </w:t>
+      </w:r>
+      <w:r>
+        <w:t>form</w:t>
+      </w:r>
+      <w:r>
+        <w:t xml:space="preserve"> </w:t>
+      </w:r>
+      <w:r>
+        <w:t>tells</w:t>
+      </w:r>
+      <w:r>
+        <w:t xml:space="preserve"> </w:t>
+      </w:r>
+      <w:r>
+        <w:t>you</w:t>
+      </w:r>
+      <w:r>
+        <w:t xml:space="preserve"> </w:t>
+      </w:r>
+      <w:r>
+        <w:t>the</w:t>
+      </w:r>
+      <w:r>
+        <w:t xml:space="preserve"> </w:t>
+      </w:r>
+      <w:r>
+        <w:t>things</w:t>
+      </w:r>
+      <w:r>
+        <w:t xml:space="preserve"> </w:t>
+      </w:r>
+      <w:r>
+        <w:t>you</w:t>
+      </w:r>
+      <w:r>
+        <w:t xml:space="preserve"> </w:t>
+      </w:r>
+      <w:r>
+        <w:t>must</w:t>
+      </w:r>
+      <w:r>
+        <w:t xml:space="preserve"> </w:t>
+      </w:r>
+      <w:r>
+        <w:t>do</w:t>
+      </w:r>
+      <w:r>
+        <w:t xml:space="preserve"> </w:t>
+      </w:r>
+      <w:r>
+        <w:t>to</w:t>
+      </w:r>
+      <w:r>
+        <w:t xml:space="preserve"> </w:t>
+      </w:r>
+      <w:r>
+        <w:t>try</w:t>
+      </w:r>
+      <w:r>
+        <w:t xml:space="preserve"> </w:t>
+      </w:r>
+      <w:r>
+        <w:t>to</w:t>
+      </w:r>
+      <w:r>
+        <w:t xml:space="preserve"> </w:t>
+      </w:r>
+      <w:r>
+        <w:t>find</w:t>
+      </w:r>
+      <w:r>
+        <w:t xml:space="preserve"> </w:t>
+      </w:r>
+      <w:r>
+        <w:t>your</w:t>
+      </w:r>
+      <w:r>
+        <w:t xml:space="preserve"> </w:t>
+      </w:r>
+      <w:r>
+        <w:t>spouse</w:t>
+      </w:r>
+      <w:r>
+        <w:t xml:space="preserve"> and serve them </w:t>
+      </w:r>
+      <w:r>
+        <w:t>before</w:t>
+      </w:r>
+      <w:r>
+        <w:t xml:space="preserve"> you can ask </w:t>
+      </w:r>
+      <w:r>
+        <w:t>for</w:t>
+      </w:r>
+      <w:r>
+        <w:t xml:space="preserve"> </w:t>
+      </w:r>
+      <w:r>
+        <w:t>alternate</w:t>
+      </w:r>
+      <w:r>
+        <w:t xml:space="preserve"> </w:t>
+      </w:r>
+      <w:r>
+        <w:t>service.</w:t>
+      </w:r>
     </w:p>
     <w:p>
       <w:pPr>
-        <w:pStyle w:val="Body"/>
+        <w:pStyle w:val="Example"/>
         <w:numPr>
           <w:ilvl w:val="0"/>
-          <w:numId w:val="50"/>
+          <w:numId w:val="12"/>
         </w:numPr>
-      </w:pPr>
-      <w:r>
-        <w:t xml:space="preserve">This form tells you the things you must do to try to find your spouse and serve them before you can ask for alternate service. </w:t>
+        <w:rPr>
+          <w:color w:val="auto"/>
+        </w:rPr>
+      </w:pPr>
+      <w:r>
+        <w:t>Important - signing your documents</w:t>
       </w:r>
     </w:p>
     <w:p>
       <w:pPr>
-        <w:pStyle w:val="Body"/>
+        <w:pStyle w:val="ListParagraph"/>
         <w:numPr>
           <w:ilvl w:val="0"/>
-          <w:numId w:val="50"/>
+          <w:numId w:val="12"/>
         </w:numPr>
       </w:pPr>
+      <w:r>
+        <w:rPr>
+          <w:color w:val="FF0000"/>
+        </w:rPr>
+        <w:t>{%p if filling_manner in('electronically', 'dunno') and filing_method in('efiling', 'dunno') %}</w:t>
+      </w:r>
+    </w:p>
+    <w:p>
+      <w:pPr>
+        <w:pStyle w:val="Exampleparagraph"/>
+        <w:numPr>
+          <w:ilvl w:val="0"/>
+          <w:numId w:val="12"/>
+        </w:numPr>
+      </w:pPr>
+      <w:r>
+        <w:t>If you fill out your forms on a computer and file them with TrueFiling, you can sign your forms electronically. Type “/s/ your name” on the signature line. For example, Zoe Lee’s signature would be "/s/ Zoe Lee."</w:t>
+      </w:r>
+    </w:p>
+    <w:p>
+      <w:pPr>
+        <w:pStyle w:val="ListParagraph"/>
+        <w:numPr>
+          <w:ilvl w:val="0"/>
+          <w:numId w:val="12"/>
+        </w:numPr>
+      </w:pPr>
+      <w:r>
+        <w:rPr>
+          <w:color w:val="FFC000"/>
+        </w:rPr>
+        <w:t>{%p if filling_manner == 'electronically' and filing_method == 'efiling' %}</w:t>
+      </w:r>
+    </w:p>
+    <w:p>
+      <w:pPr>
+        <w:pStyle w:val="ExampleorImportantblock"/>
+        <w:numPr>
+          <w:ilvl w:val="0"/>
+          <w:numId w:val="12"/>
+        </w:numPr>
+      </w:pPr>
+      <w:r>
+        <w:t xml:space="preserve">If the form needs to be notarized, fill out and file </w:t>
+      </w:r>
       <w:r>
         <w:rPr>
           <w:b/>
           <w:bCs/>
         </w:rPr>
-        <w:t>Wait to sign this form until you are in front of someone who has the power to take oaths, like a notary public. The court clerk can do this for free. Bring a valid photo ID with your signature on it with you.</w:t>
+        <w:t>Self-Certification (No Notary Available), TF-835</w:t>
+      </w:r>
+      <w:r>
+        <w:t xml:space="preserve"> [</w:t>
+      </w:r>
+      <w:hyperlink r:id="rId10" w:history="1">
+        <w:r>
+          <w:rPr>
+            <w:rStyle w:val="Hyperlink"/>
+            <w:spacing w:val="0"/>
+          </w:rPr>
+          <w:t>Fill in PDF</w:t>
+        </w:r>
+      </w:hyperlink>
+      <w:r>
+        <w:t>]</w:t>
+      </w:r>
+      <w:r>
+        <w:br/>
+      </w:r>
+      <w:hyperlink r:id="rId11" w:history="1">
+        <w:r>
+          <w:rPr>
+            <w:rStyle w:val="Hyperlink"/>
+            <w:spacing w:val="0"/>
+          </w:rPr>
+          <w:t>ak-courts.info/tf835</w:t>
+        </w:r>
+      </w:hyperlink>
+      <w:r>
+        <w:t>.</w:t>
       </w:r>
     </w:p>
     <w:p>
       <w:pPr>
-        <w:pStyle w:val="Heading3"/>
-      </w:pPr>
-      <w:r>
-        <w:t>Links in this step</w:t>
+        <w:pStyle w:val="ListParagraph"/>
+        <w:numPr>
+          <w:ilvl w:val="0"/>
+          <w:numId w:val="12"/>
+        </w:numPr>
+      </w:pPr>
+      <w:r>
+        <w:rPr>
+          <w:color w:val="FFC000"/>
+        </w:rPr>
+        <w:t>{%p endif %}</w:t>
       </w:r>
     </w:p>
     <w:p>
       <w:pPr>
+        <w:pStyle w:val="ListParagraph"/>
+        <w:numPr>
+          <w:ilvl w:val="0"/>
+          <w:numId w:val="12"/>
+        </w:numPr>
+      </w:pPr>
+      <w:r>
+        <w:rPr>
+          <w:color w:val="FF0000"/>
+        </w:rPr>
+        <w:t>{%p endif %}</w:t>
+      </w:r>
+    </w:p>
+    <w:p>
+      <w:pPr>
+        <w:pStyle w:val="ListParagraph"/>
+        <w:numPr>
+          <w:ilvl w:val="0"/>
+          <w:numId w:val="12"/>
+        </w:numPr>
+      </w:pPr>
+      <w:r>
+        <w:rPr>
+          <w:color w:val="FF0000"/>
+        </w:rPr>
+        <w:t>{%p if filling_manner in('paper', 'dunno') or filing_method in ('mail or in person', 'dunno') %}</w:t>
+      </w:r>
+    </w:p>
+    <w:p>
+      <w:pPr>
+        <w:pStyle w:val="Exampleparagraph"/>
+        <w:numPr>
+          <w:ilvl w:val="0"/>
+          <w:numId w:val="12"/>
+        </w:numPr>
+      </w:pPr>
+      <w:r>
+        <w:t>If you fill out paper copies of the forms, or do not file them with TrueFiling, read</w:t>
+      </w:r>
+      <w:r>
+        <w:t xml:space="preserve"> {{ sign_step.subject }}</w:t>
+      </w:r>
+    </w:p>
+    <w:p>
+      <w:pPr>
+        <w:pStyle w:val="ListParagraph"/>
+        <w:numPr>
+          <w:ilvl w:val="0"/>
+          <w:numId w:val="12"/>
+        </w:numPr>
+      </w:pPr>
+      <w:r>
+        <w:rPr>
+          <w:color w:val="FF0000"/>
+        </w:rPr>
+        <w:t>{%p endif %}</w:t>
+      </w:r>
+    </w:p>
+    <w:p>
+      <w:pPr>
+        <w:pStyle w:val="Example"/>
+        <w:rPr>
+          <w:color w:val="auto"/>
+        </w:rPr>
+      </w:pPr>
+      <w:r>
+        <w:t>Important - signing your documents</w:t>
+      </w:r>
+    </w:p>
+    <w:p>
+      <w:pPr>
+        <w:rPr>
+          <w:rFonts w:ascii="Helvetica" w:eastAsiaTheme="minorHAnsi" w:hAnsi="Helvetica" w:cs="Helvetica"/>
+          <w:sz w:val="24"/>
+          <w:szCs w:val="24"/>
+        </w:rPr>
+      </w:pPr>
+      <w:r>
+        <w:rPr>
+          <w:rFonts w:ascii="Helvetica" w:eastAsiaTheme="minorHAnsi" w:hAnsi="Helvetica" w:cs="Helvetica"/>
+          <w:color w:val="FF0000"/>
+          <w:sz w:val="24"/>
+          <w:szCs w:val="24"/>
+        </w:rPr>
+        <w:t>{%p</w:t>
+      </w:r>
+      <w:r>
+        <w:rPr>
+          <w:rFonts w:ascii="Helvetica" w:eastAsiaTheme="minorHAnsi" w:hAnsi="Helvetica" w:cs="Helvetica"/>
+          <w:color w:val="FF0000"/>
+          <w:sz w:val="24"/>
+          <w:szCs w:val="24"/>
+        </w:rPr>
+        <w:t xml:space="preserve"> if filling_manner in('electronically', 'dunno') and filing_method in('efiling', 'dunno')</w:t>
+      </w:r>
+      <w:r>
+        <w:rPr>
+          <w:rFonts w:ascii="Helvetica" w:eastAsiaTheme="minorHAnsi" w:hAnsi="Helvetica" w:cs="Helvetica"/>
+          <w:color w:val="FF0000"/>
+          <w:sz w:val="24"/>
+          <w:szCs w:val="24"/>
+        </w:rPr>
+        <w:t xml:space="preserve"> %}</w:t>
+      </w:r>
+    </w:p>
+    <w:p>
+      <w:pPr>
+        <w:pStyle w:val="Exampleparagraph"/>
+      </w:pPr>
+      <w:r>
+        <w:t>If you fill out your forms on a computer and file them with TrueFiling, you can sign your forms electronically. Type “/s/ your name” on the signature line. For example, Zoe Lee’s signature would be "/s/ Zoe Lee."</w:t>
+      </w:r>
+    </w:p>
+    <w:p>
+      <w:pPr>
+        <w:rPr>
+          <w:rFonts w:ascii="Helvetica" w:eastAsiaTheme="minorHAnsi" w:hAnsi="Helvetica" w:cs="Helvetica"/>
+          <w:sz w:val="24"/>
+          <w:szCs w:val="24"/>
+        </w:rPr>
+      </w:pPr>
+      <w:r>
+        <w:rPr>
+          <w:rFonts w:ascii="Helvetica" w:eastAsiaTheme="minorHAnsi" w:hAnsi="Helvetica" w:cs="Helvetica"/>
+          <w:color w:val="FFC000"/>
+          <w:sz w:val="24"/>
+          <w:szCs w:val="24"/>
+        </w:rPr>
+        <w:t>{%p</w:t>
+      </w:r>
+      <w:r>
+        <w:rPr>
+          <w:rFonts w:ascii="Helvetica" w:eastAsiaTheme="minorHAnsi" w:hAnsi="Helvetica" w:cs="Helvetica"/>
+          <w:color w:val="FFC000"/>
+          <w:sz w:val="24"/>
+          <w:szCs w:val="24"/>
+        </w:rPr>
+        <w:t xml:space="preserve"> if</w:t>
+      </w:r>
+      <w:r>
+        <w:rPr>
+          <w:rFonts w:ascii="Helvetica" w:eastAsiaTheme="minorHAnsi" w:hAnsi="Helvetica" w:cs="Helvetica"/>
+          <w:color w:val="FFC000"/>
+          <w:sz w:val="24"/>
+          <w:szCs w:val="24"/>
+        </w:rPr>
+        <w:t xml:space="preserve"> </w:t>
+      </w:r>
+      <w:r>
+        <w:rPr>
+          <w:rFonts w:ascii="Helvetica" w:eastAsiaTheme="minorHAnsi" w:hAnsi="Helvetica" w:cs="Helvetica"/>
+          <w:color w:val="FFC000"/>
+          <w:sz w:val="24"/>
+          <w:szCs w:val="24"/>
+        </w:rPr>
+        <w:t>filling_manner == 'electronically'</w:t>
+      </w:r>
+      <w:r>
+        <w:rPr>
+          <w:rFonts w:ascii="Helvetica" w:eastAsiaTheme="minorHAnsi" w:hAnsi="Helvetica" w:cs="Helvetica"/>
+          <w:color w:val="FFC000"/>
+          <w:sz w:val="24"/>
+          <w:szCs w:val="24"/>
+        </w:rPr>
+        <w:t xml:space="preserve"> and</w:t>
+      </w:r>
+      <w:r>
+        <w:rPr>
+          <w:rFonts w:ascii="Helvetica" w:eastAsiaTheme="minorHAnsi" w:hAnsi="Helvetica" w:cs="Helvetica"/>
+          <w:color w:val="FFC000"/>
+          <w:sz w:val="24"/>
+          <w:szCs w:val="24"/>
+        </w:rPr>
+        <w:t xml:space="preserve"> filing_method == 'efiling'</w:t>
+      </w:r>
+      <w:r>
+        <w:rPr>
+          <w:rFonts w:ascii="Helvetica" w:eastAsiaTheme="minorHAnsi" w:hAnsi="Helvetica" w:cs="Helvetica"/>
+          <w:color w:val="FFC000"/>
+          <w:sz w:val="24"/>
+          <w:szCs w:val="24"/>
+        </w:rPr>
+        <w:t xml:space="preserve"> %}</w:t>
+      </w:r>
+    </w:p>
+    <w:p>
+      <w:pPr>
+        <w:pStyle w:val="ExampleorImportantblock"/>
+      </w:pPr>
+      <w:r>
+        <w:t xml:space="preserve">If the form needs to be notarized, fill out and file </w:t>
+      </w:r>
+      <w:r>
+        <w:rPr>
+          <w:b/>
+          <w:bCs/>
+        </w:rPr>
+        <w:t>Self-Certification (No Notary Available), TF-835</w:t>
+      </w:r>
+      <w:r>
+        <w:t xml:space="preserve"> [</w:t>
+      </w:r>
+      <w:hyperlink r:id="rId12" w:history="1">
+        <w:r>
+          <w:rPr>
+            <w:rStyle w:val="Hyperlink"/>
+            <w:spacing w:val="0"/>
+          </w:rPr>
+          <w:t>Fill in PDF</w:t>
+        </w:r>
+      </w:hyperlink>
+      <w:r>
+        <w:t>]</w:t>
+      </w:r>
+      <w:r>
+        <w:br/>
+      </w:r>
+      <w:hyperlink r:id="rId13" w:history="1">
+        <w:r>
+          <w:rPr>
+            <w:rStyle w:val="Hyperlink"/>
+            <w:spacing w:val="0"/>
+          </w:rPr>
+          <w:t>ak-courts.info/tf835</w:t>
+        </w:r>
+      </w:hyperlink>
+      <w:r>
+        <w:t>.</w:t>
+      </w:r>
+    </w:p>
+    <w:p>
+      <w:pPr>
+        <w:rPr>
+          <w:rFonts w:ascii="Helvetica" w:eastAsiaTheme="minorHAnsi" w:hAnsi="Helvetica" w:cs="Helvetica"/>
+          <w:sz w:val="24"/>
+          <w:szCs w:val="24"/>
+        </w:rPr>
+      </w:pPr>
+      <w:r>
+        <w:rPr>
+          <w:rFonts w:ascii="Helvetica" w:eastAsiaTheme="minorHAnsi" w:hAnsi="Helvetica" w:cs="Helvetica"/>
+          <w:color w:val="FFC000"/>
+          <w:sz w:val="24"/>
+          <w:szCs w:val="24"/>
+        </w:rPr>
+        <w:t>{%p</w:t>
+      </w:r>
+      <w:r>
+        <w:rPr>
+          <w:rFonts w:ascii="Helvetica" w:eastAsiaTheme="minorHAnsi" w:hAnsi="Helvetica" w:cs="Helvetica"/>
+          <w:color w:val="FFC000"/>
+          <w:sz w:val="24"/>
+          <w:szCs w:val="24"/>
+        </w:rPr>
+        <w:t xml:space="preserve"> endi</w:t>
+      </w:r>
+      <w:r>
+        <w:rPr>
+          <w:rFonts w:ascii="Helvetica" w:eastAsiaTheme="minorHAnsi" w:hAnsi="Helvetica" w:cs="Helvetica"/>
+          <w:color w:val="FFC000"/>
+          <w:sz w:val="24"/>
+          <w:szCs w:val="24"/>
+        </w:rPr>
+        <w:t>f %}</w:t>
+      </w:r>
+    </w:p>
+    <w:p>
+      <w:pPr>
+        <w:rPr>
+          <w:rFonts w:ascii="Helvetica" w:eastAsiaTheme="minorHAnsi" w:hAnsi="Helvetica" w:cs="Helvetica"/>
+          <w:sz w:val="24"/>
+          <w:szCs w:val="24"/>
+        </w:rPr>
+      </w:pPr>
+      <w:r>
+        <w:rPr>
+          <w:rFonts w:ascii="Helvetica" w:eastAsiaTheme="minorHAnsi" w:hAnsi="Helvetica" w:cs="Helvetica"/>
+          <w:color w:val="FF0000"/>
+          <w:sz w:val="24"/>
+          <w:szCs w:val="24"/>
+        </w:rPr>
+        <w:t>{%p</w:t>
+      </w:r>
+      <w:r>
+        <w:rPr>
+          <w:rFonts w:ascii="Helvetica" w:eastAsiaTheme="minorHAnsi" w:hAnsi="Helvetica" w:cs="Helvetica"/>
+          <w:color w:val="FF0000"/>
+          <w:sz w:val="24"/>
+          <w:szCs w:val="24"/>
+        </w:rPr>
+        <w:t xml:space="preserve"> endi</w:t>
+      </w:r>
+      <w:r>
+        <w:rPr>
+          <w:rFonts w:ascii="Helvetica" w:eastAsiaTheme="minorHAnsi" w:hAnsi="Helvetica" w:cs="Helvetica"/>
+          <w:color w:val="FF0000"/>
+          <w:sz w:val="24"/>
+          <w:szCs w:val="24"/>
+        </w:rPr>
+        <w:t>f %}</w:t>
+      </w:r>
+    </w:p>
+    <w:p>
+      <w:pPr>
+        <w:rPr>
+          <w:rFonts w:ascii="Helvetica" w:eastAsiaTheme="minorHAnsi" w:hAnsi="Helvetica" w:cs="Helvetica"/>
+          <w:sz w:val="24"/>
+          <w:szCs w:val="24"/>
+        </w:rPr>
+      </w:pPr>
+      <w:r>
+        <w:rPr>
+          <w:rFonts w:ascii="Helvetica" w:eastAsiaTheme="minorHAnsi" w:hAnsi="Helvetica" w:cs="Helvetica"/>
+          <w:color w:val="FF0000"/>
+          <w:sz w:val="24"/>
+          <w:szCs w:val="24"/>
+        </w:rPr>
+        <w:t>{%p</w:t>
+      </w:r>
+      <w:r>
+        <w:rPr>
+          <w:rFonts w:ascii="Helvetica" w:eastAsiaTheme="minorHAnsi" w:hAnsi="Helvetica" w:cs="Helvetica"/>
+          <w:color w:val="FF0000"/>
+          <w:sz w:val="24"/>
+          <w:szCs w:val="24"/>
+        </w:rPr>
+        <w:t xml:space="preserve"> if filling_manner in('paper', 'dunno') or filing_method in ('mail or in person', 'dunno'</w:t>
+      </w:r>
+      <w:r>
+        <w:rPr>
+          <w:rFonts w:ascii="Helvetica" w:eastAsiaTheme="minorHAnsi" w:hAnsi="Helvetica" w:cs="Helvetica"/>
+          <w:color w:val="FF0000"/>
+          <w:sz w:val="24"/>
+          <w:szCs w:val="24"/>
+        </w:rPr>
+        <w:t>) %}</w:t>
+      </w:r>
+    </w:p>
+    <w:p>
+      <w:pPr>
+        <w:pStyle w:val="Exampleparagraph"/>
+      </w:pPr>
+      <w:r>
+        <w:t>If you fill out paper copies of the forms, or do not file them with TrueFiling, read</w:t>
+      </w:r>
+      <w:r>
+        <w:t xml:space="preserve"> {{ sign_step.subject }}</w:t>
+      </w:r>
+    </w:p>
+    <w:p>
+      <w:r>
+        <w:rPr>
+          <w:rFonts w:ascii="Helvetica" w:eastAsiaTheme="minorHAnsi" w:hAnsi="Helvetica" w:cs="Helvetica"/>
+          <w:color w:val="FF0000"/>
+          <w:sz w:val="24"/>
+          <w:szCs w:val="24"/>
+        </w:rPr>
+        <w:t>{%p</w:t>
+      </w:r>
+      <w:r>
+        <w:rPr>
+          <w:rFonts w:ascii="Helvetica" w:eastAsiaTheme="minorHAnsi" w:hAnsi="Helvetica" w:cs="Helvetica"/>
+          <w:color w:val="FF0000"/>
+          <w:sz w:val="24"/>
+          <w:szCs w:val="24"/>
+        </w:rPr>
+        <w:t xml:space="preserve"> </w:t>
+      </w:r>
+      <w:r>
+        <w:rPr>
+          <w:rFonts w:ascii="Helvetica" w:eastAsiaTheme="minorHAnsi" w:hAnsi="Helvetica" w:cs="Helvetica"/>
+          <w:color w:val="FF0000"/>
+          <w:sz w:val="24"/>
+          <w:szCs w:val="24"/>
+        </w:rPr>
+        <w:t>end</w:t>
+      </w:r>
+      <w:r>
+        <w:rPr>
+          <w:rFonts w:ascii="Helvetica" w:eastAsiaTheme="minorHAnsi" w:hAnsi="Helvetica" w:cs="Helvetica"/>
+          <w:color w:val="FF0000"/>
+          <w:sz w:val="24"/>
+          <w:szCs w:val="24"/>
+        </w:rPr>
+        <w:t>if</w:t>
+      </w:r>
+      <w:r>
+        <w:rPr>
+          <w:rFonts w:ascii="Helvetica" w:eastAsiaTheme="minorHAnsi" w:hAnsi="Helvetica" w:cs="Helvetica"/>
+          <w:color w:val="FF0000"/>
+          <w:sz w:val="24"/>
+          <w:szCs w:val="24"/>
+        </w:rPr>
+        <w:t xml:space="preserve"> %}</w:t>
+      </w:r>
+    </w:p>
+    <w:p>
+      <w:pPr>
+        <w:pStyle w:val="Heading3"/>
+      </w:pPr>
+      <w:r>
+        <w:t>Links in this step</w:t>
+      </w:r>
+    </w:p>
+    <w:p>
+      <w:pPr>
         <w:pStyle w:val="Body"/>
       </w:pPr>
-      <w:hyperlink r:id="rId7" w:history="1">
+      <w:hyperlink r:id="rId14" w:history="1">
         <w:r>
           <w:rPr>
             <w:rStyle w:val="Hyperlink"/>
@@ -144,61 +802,257 @@
         </w:rPr>
         <w:br/>
       </w:r>
-      <w:hyperlink r:id="rId8" w:history="1">
+      <w:hyperlink r:id="rId15" w:history="1">
         <w:r>
           <w:rPr>
             <w:rStyle w:val="Hyperlink"/>
             <w:spacing w:val="0"/>
           </w:rPr>
-          <w:t>courts.alaska.gov/</w:t>
+          <w:t>courts.alaska.gov/shc/family/shctips.htm</w:t>
         </w:r>
-        <w:proofErr w:type="spellStart"/>
+      </w:hyperlink>
+    </w:p>
+    <w:p>
+      <w:pPr>
+        <w:pStyle w:val="Body"/>
+      </w:pPr>
+      <w:r>
+        <w:rPr>
+          <w:b/>
+          <w:bCs/>
+        </w:rPr>
+        <w:t>Request</w:t>
+      </w:r>
+      <w:r>
+        <w:rPr>
+          <w:b/>
+          <w:bCs/>
+        </w:rPr>
+        <w:t xml:space="preserve"> </w:t>
+      </w:r>
+      <w:r>
+        <w:rPr>
+          <w:b/>
+          <w:bCs/>
+        </w:rPr>
+        <w:t>to</w:t>
+      </w:r>
+      <w:r>
+        <w:rPr>
+          <w:b/>
+          <w:bCs/>
+        </w:rPr>
+        <w:t xml:space="preserve"> </w:t>
+      </w:r>
+      <w:r>
+        <w:rPr>
+          <w:b/>
+          <w:bCs/>
+        </w:rPr>
+        <w:t>Serve</w:t>
+      </w:r>
+      <w:r>
+        <w:rPr>
+          <w:b/>
+          <w:bCs/>
+        </w:rPr>
+        <w:t xml:space="preserve"> </w:t>
+      </w:r>
+      <w:r>
+        <w:rPr>
+          <w:b/>
+          <w:bCs/>
+        </w:rPr>
+        <w:t>Defendant</w:t>
+      </w:r>
+      <w:r>
+        <w:rPr>
+          <w:b/>
+          <w:bCs/>
+        </w:rPr>
+        <w:t xml:space="preserve"> </w:t>
+      </w:r>
+      <w:r>
+        <w:rPr>
+          <w:b/>
+          <w:bCs/>
+        </w:rPr>
+        <w:t>by</w:t>
+      </w:r>
+      <w:r>
+        <w:rPr>
+          <w:b/>
+          <w:bCs/>
+        </w:rPr>
+        <w:t xml:space="preserve"> </w:t>
+      </w:r>
+      <w:r>
+        <w:rPr>
+          <w:b/>
+          <w:bCs/>
+        </w:rPr>
+        <w:t>Posting</w:t>
+      </w:r>
+      <w:r>
+        <w:rPr>
+          <w:b/>
+          <w:bCs/>
+        </w:rPr>
+        <w:t xml:space="preserve"> </w:t>
+      </w:r>
+      <w:r>
+        <w:rPr>
+          <w:b/>
+          <w:bCs/>
+        </w:rPr>
+        <w:t>or</w:t>
+      </w:r>
+      <w:r>
+        <w:rPr>
+          <w:b/>
+          <w:bCs/>
+        </w:rPr>
+        <w:t xml:space="preserve"> </w:t>
+      </w:r>
+      <w:r>
+        <w:rPr>
+          <w:b/>
+          <w:bCs/>
+        </w:rPr>
+        <w:t>Alternative</w:t>
+      </w:r>
+      <w:r>
+        <w:rPr>
+          <w:b/>
+          <w:bCs/>
+        </w:rPr>
+        <w:t xml:space="preserve"> </w:t>
+      </w:r>
+      <w:r>
+        <w:rPr>
+          <w:b/>
+          <w:bCs/>
+        </w:rPr>
+        <w:t>Service,</w:t>
+      </w:r>
+      <w:r>
+        <w:rPr>
+          <w:b/>
+          <w:bCs/>
+        </w:rPr>
+        <w:t xml:space="preserve"> </w:t>
+      </w:r>
+      <w:r>
+        <w:rPr>
+          <w:b/>
+          <w:bCs/>
+        </w:rPr>
+        <w:t>and</w:t>
+      </w:r>
+      <w:r>
+        <w:rPr>
+          <w:b/>
+          <w:bCs/>
+        </w:rPr>
+        <w:t xml:space="preserve"> </w:t>
+      </w:r>
+      <w:r>
+        <w:rPr>
+          <w:b/>
+          <w:bCs/>
+        </w:rPr>
+        <w:t>Affidavit</w:t>
+      </w:r>
+      <w:r>
+        <w:rPr>
+          <w:b/>
+          <w:bCs/>
+        </w:rPr>
+        <w:t xml:space="preserve"> </w:t>
+      </w:r>
+      <w:r>
+        <w:rPr>
+          <w:b/>
+          <w:bCs/>
+        </w:rPr>
+        <w:t>of</w:t>
+      </w:r>
+      <w:r>
+        <w:rPr>
+          <w:b/>
+          <w:bCs/>
+        </w:rPr>
+        <w:t xml:space="preserve"> </w:t>
+      </w:r>
+      <w:r>
+        <w:rPr>
+          <w:b/>
+          <w:bCs/>
+        </w:rPr>
+        <w:t>Diligent</w:t>
+      </w:r>
+      <w:r>
+        <w:rPr>
+          <w:b/>
+          <w:bCs/>
+        </w:rPr>
+        <w:t xml:space="preserve"> </w:t>
+      </w:r>
+      <w:r>
+        <w:rPr>
+          <w:b/>
+          <w:bCs/>
+        </w:rPr>
+        <w:t>Inquiry</w:t>
+      </w:r>
+      <w:r>
+        <w:t>,</w:t>
+      </w:r>
+      <w:r>
+        <w:t xml:space="preserve"> </w:t>
+      </w:r>
+      <w:r>
+        <w:rPr>
+          <w:b/>
+          <w:bCs/>
+        </w:rPr>
+        <w:t>CIV-145</w:t>
+      </w:r>
+      <w:r>
+        <w:t xml:space="preserve"> [</w:t>
+      </w:r>
+      <w:hyperlink r:id="rId16" w:history="1">
+        <w:r>
+          <w:rPr>
+            <w:rStyle w:val="Hyperlink"/>
+          </w:rPr>
+          <w:t>Fill-in PDF</w:t>
+        </w:r>
+      </w:hyperlink>
+      <w:r>
+        <w:t>]</w:t>
+      </w:r>
+      <w:r>
+        <w:br/>
+      </w:r>
+      <w:hyperlink r:id="rId17" w:history="1">
         <w:r>
           <w:rPr>
             <w:rStyle w:val="Hyperlink"/>
             <w:spacing w:val="0"/>
           </w:rPr>
-          <w:t>shc</w:t>
-        </w:r>
-        <w:proofErr w:type="spellEnd"/>
-        <w:r>
-          <w:rPr>
-            <w:rStyle w:val="Hyperlink"/>
-            <w:spacing w:val="0"/>
-          </w:rPr>
-          <w:t>/family/shctips.htm</w:t>
+          <w:t>ak-courts.info/civ145</w:t>
         </w:r>
       </w:hyperlink>
     </w:p>
-    <w:p>
-      <w:pPr>
-        <w:pStyle w:val="Body"/>
-      </w:pPr>
-      <w:r>
-        <w:rPr>
-          <w:b/>
-          <w:bCs/>
-        </w:rPr>
-        <w:t>Request to Serve Defendant by Posting or Alternative Service, and Affidavit of Diligent Inquiry, CIV-145 []</w:t>
-        <w:br/>
-        <w:t>public.courts.alaska.gov/web/forms/docs/civ-145.pdf</w:t>
-      </w:r>
-      <w:hyperlink r:id="rId9" w:history="1">
-        <w:r>
-          <w:rPr>
-            <w:rStyle w:val="Hyperlink"/>
-          </w:rPr>
-          <w:t>Fill-In PDF</w:t>
-        </w:r>
-      </w:hyperlink>
-    </w:p>
+    <w:p/>
     <w:sectPr>
-      <w:headerReference w:type="default" r:id="rId12"/>
-      <w:headerReference w:type="first" r:id="rId13"/>
-      <w:headerReference w:type="even" r:id="rId14"/>
-      <w:footerReference w:type="default" r:id="rId15"/>
-      <w:footerReference w:type="first" r:id="rId16"/>
-      <w:footerReference w:type="even" r:id="rId17"/>
+      <w:headerReference w:type="even" r:id="rId18"/>
+      <w:headerReference w:type="default" r:id="rId19"/>
+      <w:footerReference w:type="even" r:id="rId20"/>
+      <w:footerReference w:type="default" r:id="rId21"/>
+      <w:headerReference w:type="first" r:id="rId22"/>
+      <w:footerReference w:type="first" r:id="rId23"/>
       <w:pgSz w:w="12240" w:h="15840"/>
       <w:pgMar w:top="1440" w:right="1440" w:bottom="1440" w:left="1440" w:header="720" w:footer="720" w:gutter="0"/>
       <w:cols w:space="720"/>
@@ -208,8 +1062,33 @@
 </w:document>
 </file>
 
+<file path=word/endnotes.xml><?xml version="1.0" encoding="utf-8"?>
+<w:endnotes xmlns:wpc="http://schemas.microsoft.com/office/word/2010/wordprocessingCanvas" xmlns:cx="http://schemas.microsoft.com/office/drawing/2014/chartex" xmlns:cx1="http://schemas.microsoft.com/office/drawing/2015/9/8/chartex" xmlns:cx2="http://schemas.microsoft.com/office/drawing/2015/10/21/chartex" xmlns:cx3="http://schemas.microsoft.com/office/drawing/2016/5/9/chartex" xmlns:cx4="http://schemas.microsoft.com/office/drawing/2016/5/10/chartex" xmlns:cx5="http://schemas.microsoft.com/office/drawing/2016/5/11/chartex" xmlns:cx6="http://schemas.microsoft.com/office/drawing/2016/5/12/chartex" xmlns:cx7="http://schemas.microsoft.com/office/drawing/2016/5/13/chartex" xmlns:cx8="http://schemas.microsoft.com/office/drawing/2016/5/14/chartex" xmlns:mc="http://schemas.openxmlformats.org/markup-compatibility/2006" xmlns:aink="http://schemas.microsoft.com/office/drawing/2016/ink" xmlns:am3d="http://schemas.microsoft.com/office/drawing/2017/model3d" xmlns:o="urn:schemas-microsoft-com:office:office" xmlns:r="http://schemas.openxmlformats.org/officeDocument/2006/relationships" xmlns:m="http://schemas.openxmlformats.org/officeDocument/2006/math" xmlns:v="urn:schemas-microsoft-com:vml" xmlns:wp14="http://schemas.microsoft.com/office/word/2010/wordprocessingDrawing" xmlns:wp="http://schemas.openxmlformats.org/drawingml/2006/wordprocessingDrawing" xmlns:w10="urn:schemas-microsoft-com:office:word" xmlns:w="http://schemas.openxmlformats.org/wordprocessingml/2006/main" xmlns:w14="http://schemas.microsoft.com/office/word/2010/wordml" xmlns:w15="http://schemas.microsoft.com/office/word/2012/wordml" xmlns:w16cex="http://schemas.microsoft.com/office/word/2018/wordml/cex" xmlns:w16cid="http://schemas.microsoft.com/office/word/2016/wordml/cid" xmlns:w16="http://schemas.microsoft.com/office/word/2018/wordml" xmlns:w16sdtdh="http://schemas.microsoft.com/office/word/2020/wordml/sdtdatahash" xmlns:w16se="http://schemas.microsoft.com/office/word/2015/wordml/symex" xmlns:wpg="http://schemas.microsoft.com/office/word/2010/wordprocessingGroup" xmlns:wpi="http://schemas.microsoft.com/office/word/2010/wordprocessingInk" xmlns:wne="http://schemas.microsoft.com/office/word/2006/wordml" xmlns:wps="http://schemas.microsoft.com/office/word/2010/wordprocessingShape" mc:Ignorable="w14 w15 w16se w16cid w16 w16cex w16sdtdh wp14">
+  <w:endnote w:type="separator" w:id="-1">
+    <w:p>
+      <w:pPr>
+        <w:spacing w:before="0" w:after="0"/>
+      </w:pPr>
+      <w:r>
+        <w:separator/>
+      </w:r>
+    </w:p>
+  </w:endnote>
+  <w:endnote w:type="continuationSeparator" w:id="0">
+    <w:p>
+      <w:pPr>
+        <w:spacing w:before="0" w:after="0"/>
+      </w:pPr>
+      <w:r>
+        <w:continuationSeparator/>
+      </w:r>
+    </w:p>
+  </w:endnote>
+</w:endnotes>
+</file>
+
 <file path=word/footer1.xml><?xml version="1.0" encoding="utf-8"?>
-<w:ftr xmlns:m="http://schemas.openxmlformats.org/officeDocument/2006/math" xmlns:mc="http://schemas.openxmlformats.org/markup-compatibility/2006" xmlns:mo="http://schemas.microsoft.com/office/mac/office/2008/main" xmlns:mv="urn:schemas-microsoft-com:mac:vml" xmlns:o="urn:schemas-microsoft-com:office:office" xmlns:r="http://schemas.openxmlformats.org/officeDocument/2006/relationships" xmlns:v="urn:schemas-microsoft-com:vml" xmlns:w10="urn:schemas-microsoft-com:office:word" xmlns:w14="http://schemas.microsoft.com/office/word/2010/wordml" xmlns:w="http://schemas.openxmlformats.org/wordprocessingml/2006/main" xmlns:wne="http://schemas.microsoft.com/office/word/2006/wordml" xmlns:wp14="http://schemas.microsoft.com/office/word/2010/wordprocessingDrawing" xmlns:wp="http://schemas.openxmlformats.org/drawingml/2006/wordprocessingDrawing" xmlns:wpc="http://schemas.microsoft.com/office/word/2010/wordprocessingCanvas" xmlns:wpg="http://schemas.microsoft.com/office/word/2010/wordprocessingGroup" xmlns:wpi="http://schemas.microsoft.com/office/word/2010/wordprocessingInk" xmlns:wps="http://schemas.microsoft.com/office/word/2010/wordprocessingShape" mc:Ignorable="w14 wp14">
+<w:ftr xmlns:wpc="http://schemas.microsoft.com/office/word/2010/wordprocessingCanvas" xmlns:cx="http://schemas.microsoft.com/office/drawing/2014/chartex" xmlns:cx1="http://schemas.microsoft.com/office/drawing/2015/9/8/chartex" xmlns:cx2="http://schemas.microsoft.com/office/drawing/2015/10/21/chartex" xmlns:cx3="http://schemas.microsoft.com/office/drawing/2016/5/9/chartex" xmlns:cx4="http://schemas.microsoft.com/office/drawing/2016/5/10/chartex" xmlns:cx5="http://schemas.microsoft.com/office/drawing/2016/5/11/chartex" xmlns:cx6="http://schemas.microsoft.com/office/drawing/2016/5/12/chartex" xmlns:cx7="http://schemas.microsoft.com/office/drawing/2016/5/13/chartex" xmlns:cx8="http://schemas.microsoft.com/office/drawing/2016/5/14/chartex" xmlns:mc="http://schemas.openxmlformats.org/markup-compatibility/2006" xmlns:aink="http://schemas.microsoft.com/office/drawing/2016/ink" xmlns:am3d="http://schemas.microsoft.com/office/drawing/2017/model3d" xmlns:o="urn:schemas-microsoft-com:office:office" xmlns:r="http://schemas.openxmlformats.org/officeDocument/2006/relationships" xmlns:m="http://schemas.openxmlformats.org/officeDocument/2006/math" xmlns:v="urn:schemas-microsoft-com:vml" xmlns:wp14="http://schemas.microsoft.com/office/word/2010/wordprocessingDrawing" xmlns:wp="http://schemas.openxmlformats.org/drawingml/2006/wordprocessingDrawing" xmlns:w10="urn:schemas-microsoft-com:office:word" xmlns:w="http://schemas.openxmlformats.org/wordprocessingml/2006/main" xmlns:w14="http://schemas.microsoft.com/office/word/2010/wordml" xmlns:w15="http://schemas.microsoft.com/office/word/2012/wordml" xmlns:w16cex="http://schemas.microsoft.com/office/word/2018/wordml/cex" xmlns:w16cid="http://schemas.microsoft.com/office/word/2016/wordml/cid" xmlns:w16="http://schemas.microsoft.com/office/word/2018/wordml" xmlns:w16sdtdh="http://schemas.microsoft.com/office/word/2020/wordml/sdtdatahash" xmlns:w16se="http://schemas.microsoft.com/office/word/2015/wordml/symex" xmlns:wpg="http://schemas.microsoft.com/office/word/2010/wordprocessingGroup" xmlns:wpi="http://schemas.microsoft.com/office/word/2010/wordprocessingInk" xmlns:wne="http://schemas.microsoft.com/office/word/2006/wordml" xmlns:wps="http://schemas.microsoft.com/office/word/2010/wordprocessingShape" mc:Ignorable="w14 w15 w16se w16cid w16 w16cex w16sdtdh wp14">
   <w:p>
     <w:pPr>
       <w:pStyle w:val="Footer"/>
@@ -219,7 +1098,7 @@
 </file>
 
 <file path=word/footer2.xml><?xml version="1.0" encoding="utf-8"?>
-<w:ftr xmlns:m="http://schemas.openxmlformats.org/officeDocument/2006/math" xmlns:mc="http://schemas.openxmlformats.org/markup-compatibility/2006" xmlns:mo="http://schemas.microsoft.com/office/mac/office/2008/main" xmlns:mv="urn:schemas-microsoft-com:mac:vml" xmlns:o="urn:schemas-microsoft-com:office:office" xmlns:r="http://schemas.openxmlformats.org/officeDocument/2006/relationships" xmlns:v="urn:schemas-microsoft-com:vml" xmlns:w10="urn:schemas-microsoft-com:office:word" xmlns:w14="http://schemas.microsoft.com/office/word/2010/wordml" xmlns:w="http://schemas.openxmlformats.org/wordprocessingml/2006/main" xmlns:wne="http://schemas.microsoft.com/office/word/2006/wordml" xmlns:wp14="http://schemas.microsoft.com/office/word/2010/wordprocessingDrawing" xmlns:wp="http://schemas.openxmlformats.org/drawingml/2006/wordprocessingDrawing" xmlns:wpc="http://schemas.microsoft.com/office/word/2010/wordprocessingCanvas" xmlns:wpg="http://schemas.microsoft.com/office/word/2010/wordprocessingGroup" xmlns:wpi="http://schemas.microsoft.com/office/word/2010/wordprocessingInk" xmlns:wps="http://schemas.microsoft.com/office/word/2010/wordprocessingShape" mc:Ignorable="w14 wp14">
+<w:ftr xmlns:wpc="http://schemas.microsoft.com/office/word/2010/wordprocessingCanvas" xmlns:cx="http://schemas.microsoft.com/office/drawing/2014/chartex" xmlns:cx1="http://schemas.microsoft.com/office/drawing/2015/9/8/chartex" xmlns:cx2="http://schemas.microsoft.com/office/drawing/2015/10/21/chartex" xmlns:cx3="http://schemas.microsoft.com/office/drawing/2016/5/9/chartex" xmlns:cx4="http://schemas.microsoft.com/office/drawing/2016/5/10/chartex" xmlns:cx5="http://schemas.microsoft.com/office/drawing/2016/5/11/chartex" xmlns:cx6="http://schemas.microsoft.com/office/drawing/2016/5/12/chartex" xmlns:cx7="http://schemas.microsoft.com/office/drawing/2016/5/13/chartex" xmlns:cx8="http://schemas.microsoft.com/office/drawing/2016/5/14/chartex" xmlns:mc="http://schemas.openxmlformats.org/markup-compatibility/2006" xmlns:aink="http://schemas.microsoft.com/office/drawing/2016/ink" xmlns:am3d="http://schemas.microsoft.com/office/drawing/2017/model3d" xmlns:o="urn:schemas-microsoft-com:office:office" xmlns:r="http://schemas.openxmlformats.org/officeDocument/2006/relationships" xmlns:m="http://schemas.openxmlformats.org/officeDocument/2006/math" xmlns:v="urn:schemas-microsoft-com:vml" xmlns:wp14="http://schemas.microsoft.com/office/word/2010/wordprocessingDrawing" xmlns:wp="http://schemas.openxmlformats.org/drawingml/2006/wordprocessingDrawing" xmlns:w10="urn:schemas-microsoft-com:office:word" xmlns:w="http://schemas.openxmlformats.org/wordprocessingml/2006/main" xmlns:w14="http://schemas.microsoft.com/office/word/2010/wordml" xmlns:w15="http://schemas.microsoft.com/office/word/2012/wordml" xmlns:w16cex="http://schemas.microsoft.com/office/word/2018/wordml/cex" xmlns:w16cid="http://schemas.microsoft.com/office/word/2016/wordml/cid" xmlns:w16="http://schemas.microsoft.com/office/word/2018/wordml" xmlns:w16sdtdh="http://schemas.microsoft.com/office/word/2020/wordml/sdtdatahash" xmlns:w16se="http://schemas.microsoft.com/office/word/2015/wordml/symex" xmlns:wpg="http://schemas.microsoft.com/office/word/2010/wordprocessingGroup" xmlns:wpi="http://schemas.microsoft.com/office/word/2010/wordprocessingInk" xmlns:wne="http://schemas.microsoft.com/office/word/2006/wordml" xmlns:wps="http://schemas.microsoft.com/office/word/2010/wordprocessingShape" mc:Ignorable="w14 w15 w16se w16cid w16 w16cex w16sdtdh wp14">
   <w:p>
     <w:pPr>
       <w:pStyle w:val="Footer"/>
@@ -229,7 +1108,7 @@
 </file>
 
 <file path=word/footer3.xml><?xml version="1.0" encoding="utf-8"?>
-<w:ftr xmlns:m="http://schemas.openxmlformats.org/officeDocument/2006/math" xmlns:mc="http://schemas.openxmlformats.org/markup-compatibility/2006" xmlns:mo="http://schemas.microsoft.com/office/mac/office/2008/main" xmlns:mv="urn:schemas-microsoft-com:mac:vml" xmlns:o="urn:schemas-microsoft-com:office:office" xmlns:r="http://schemas.openxmlformats.org/officeDocument/2006/relationships" xmlns:v="urn:schemas-microsoft-com:vml" xmlns:w10="urn:schemas-microsoft-com:office:word" xmlns:w14="http://schemas.microsoft.com/office/word/2010/wordml" xmlns:w="http://schemas.openxmlformats.org/wordprocessingml/2006/main" xmlns:wne="http://schemas.microsoft.com/office/word/2006/wordml" xmlns:wp14="http://schemas.microsoft.com/office/word/2010/wordprocessingDrawing" xmlns:wp="http://schemas.openxmlformats.org/drawingml/2006/wordprocessingDrawing" xmlns:wpc="http://schemas.microsoft.com/office/word/2010/wordprocessingCanvas" xmlns:wpg="http://schemas.microsoft.com/office/word/2010/wordprocessingGroup" xmlns:wpi="http://schemas.microsoft.com/office/word/2010/wordprocessingInk" xmlns:wps="http://schemas.microsoft.com/office/word/2010/wordprocessingShape" mc:Ignorable="w14 wp14">
+<w:ftr xmlns:wpc="http://schemas.microsoft.com/office/word/2010/wordprocessingCanvas" xmlns:cx="http://schemas.microsoft.com/office/drawing/2014/chartex" xmlns:cx1="http://schemas.microsoft.com/office/drawing/2015/9/8/chartex" xmlns:cx2="http://schemas.microsoft.com/office/drawing/2015/10/21/chartex" xmlns:cx3="http://schemas.microsoft.com/office/drawing/2016/5/9/chartex" xmlns:cx4="http://schemas.microsoft.com/office/drawing/2016/5/10/chartex" xmlns:cx5="http://schemas.microsoft.com/office/drawing/2016/5/11/chartex" xmlns:cx6="http://schemas.microsoft.com/office/drawing/2016/5/12/chartex" xmlns:cx7="http://schemas.microsoft.com/office/drawing/2016/5/13/chartex" xmlns:cx8="http://schemas.microsoft.com/office/drawing/2016/5/14/chartex" xmlns:mc="http://schemas.openxmlformats.org/markup-compatibility/2006" xmlns:aink="http://schemas.microsoft.com/office/drawing/2016/ink" xmlns:am3d="http://schemas.microsoft.com/office/drawing/2017/model3d" xmlns:o="urn:schemas-microsoft-com:office:office" xmlns:r="http://schemas.openxmlformats.org/officeDocument/2006/relationships" xmlns:m="http://schemas.openxmlformats.org/officeDocument/2006/math" xmlns:v="urn:schemas-microsoft-com:vml" xmlns:wp14="http://schemas.microsoft.com/office/word/2010/wordprocessingDrawing" xmlns:wp="http://schemas.openxmlformats.org/drawingml/2006/wordprocessingDrawing" xmlns:w10="urn:schemas-microsoft-com:office:word" xmlns:w="http://schemas.openxmlformats.org/wordprocessingml/2006/main" xmlns:w14="http://schemas.microsoft.com/office/word/2010/wordml" xmlns:w15="http://schemas.microsoft.com/office/word/2012/wordml" xmlns:w16cex="http://schemas.microsoft.com/office/word/2018/wordml/cex" xmlns:w16cid="http://schemas.microsoft.com/office/word/2016/wordml/cid" xmlns:w16="http://schemas.microsoft.com/office/word/2018/wordml" xmlns:w16sdtdh="http://schemas.microsoft.com/office/word/2020/wordml/sdtdatahash" xmlns:w16se="http://schemas.microsoft.com/office/word/2015/wordml/symex" xmlns:wpg="http://schemas.microsoft.com/office/word/2010/wordprocessingGroup" xmlns:wpi="http://schemas.microsoft.com/office/word/2010/wordprocessingInk" xmlns:wne="http://schemas.microsoft.com/office/word/2006/wordml" xmlns:wps="http://schemas.microsoft.com/office/word/2010/wordprocessingShape" mc:Ignorable="w14 w15 w16se w16cid w16 w16cex w16sdtdh wp14">
   <w:p>
     <w:pPr>
       <w:pStyle w:val="Footer"/>
@@ -238,8 +1117,33 @@
 </w:ftr>
 </file>
 
+<file path=word/footnotes.xml><?xml version="1.0" encoding="utf-8"?>
+<w:footnotes xmlns:wpc="http://schemas.microsoft.com/office/word/2010/wordprocessingCanvas" xmlns:cx="http://schemas.microsoft.com/office/drawing/2014/chartex" xmlns:cx1="http://schemas.microsoft.com/office/drawing/2015/9/8/chartex" xmlns:cx2="http://schemas.microsoft.com/office/drawing/2015/10/21/chartex" xmlns:cx3="http://schemas.microsoft.com/office/drawing/2016/5/9/chartex" xmlns:cx4="http://schemas.microsoft.com/office/drawing/2016/5/10/chartex" xmlns:cx5="http://schemas.microsoft.com/office/drawing/2016/5/11/chartex" xmlns:cx6="http://schemas.microsoft.com/office/drawing/2016/5/12/chartex" xmlns:cx7="http://schemas.microsoft.com/office/drawing/2016/5/13/chartex" xmlns:cx8="http://schemas.microsoft.com/office/drawing/2016/5/14/chartex" xmlns:mc="http://schemas.openxmlformats.org/markup-compatibility/2006" xmlns:aink="http://schemas.microsoft.com/office/drawing/2016/ink" xmlns:am3d="http://schemas.microsoft.com/office/drawing/2017/model3d" xmlns:o="urn:schemas-microsoft-com:office:office" xmlns:r="http://schemas.openxmlformats.org/officeDocument/2006/relationships" xmlns:m="http://schemas.openxmlformats.org/officeDocument/2006/math" xmlns:v="urn:schemas-microsoft-com:vml" xmlns:wp14="http://schemas.microsoft.com/office/word/2010/wordprocessingDrawing" xmlns:wp="http://schemas.openxmlformats.org/drawingml/2006/wordprocessingDrawing" xmlns:w10="urn:schemas-microsoft-com:office:word" xmlns:w="http://schemas.openxmlformats.org/wordprocessingml/2006/main" xmlns:w14="http://schemas.microsoft.com/office/word/2010/wordml" xmlns:w15="http://schemas.microsoft.com/office/word/2012/wordml" xmlns:w16cex="http://schemas.microsoft.com/office/word/2018/wordml/cex" xmlns:w16cid="http://schemas.microsoft.com/office/word/2016/wordml/cid" xmlns:w16="http://schemas.microsoft.com/office/word/2018/wordml" xmlns:w16sdtdh="http://schemas.microsoft.com/office/word/2020/wordml/sdtdatahash" xmlns:w16se="http://schemas.microsoft.com/office/word/2015/wordml/symex" xmlns:wpg="http://schemas.microsoft.com/office/word/2010/wordprocessingGroup" xmlns:wpi="http://schemas.microsoft.com/office/word/2010/wordprocessingInk" xmlns:wne="http://schemas.microsoft.com/office/word/2006/wordml" xmlns:wps="http://schemas.microsoft.com/office/word/2010/wordprocessingShape" mc:Ignorable="w14 w15 w16se w16cid w16 w16cex w16sdtdh wp14">
+  <w:footnote w:type="separator" w:id="-1">
+    <w:p>
+      <w:pPr>
+        <w:spacing w:before="0" w:after="0"/>
+      </w:pPr>
+      <w:r>
+        <w:separator/>
+      </w:r>
+    </w:p>
+  </w:footnote>
+  <w:footnote w:type="continuationSeparator" w:id="0">
+    <w:p>
+      <w:pPr>
+        <w:spacing w:before="0" w:after="0"/>
+      </w:pPr>
+      <w:r>
+        <w:continuationSeparator/>
+      </w:r>
+    </w:p>
+  </w:footnote>
+</w:footnotes>
+</file>
+
 <file path=word/header1.xml><?xml version="1.0" encoding="utf-8"?>
-<w:hdr xmlns:m="http://schemas.openxmlformats.org/officeDocument/2006/math" xmlns:mc="http://schemas.openxmlformats.org/markup-compatibility/2006" xmlns:mo="http://schemas.microsoft.com/office/mac/office/2008/main" xmlns:mv="urn:schemas-microsoft-com:mac:vml" xmlns:o="urn:schemas-microsoft-com:office:office" xmlns:r="http://schemas.openxmlformats.org/officeDocument/2006/relationships" xmlns:v="urn:schemas-microsoft-com:vml" xmlns:w10="urn:schemas-microsoft-com:office:word" xmlns:w14="http://schemas.microsoft.com/office/word/2010/wordml" xmlns:w="http://schemas.openxmlformats.org/wordprocessingml/2006/main" xmlns:wne="http://schemas.microsoft.com/office/word/2006/wordml" xmlns:wp14="http://schemas.microsoft.com/office/word/2010/wordprocessingDrawing" xmlns:wp="http://schemas.openxmlformats.org/drawingml/2006/wordprocessingDrawing" xmlns:wpc="http://schemas.microsoft.com/office/word/2010/wordprocessingCanvas" xmlns:wpg="http://schemas.microsoft.com/office/word/2010/wordprocessingGroup" xmlns:wpi="http://schemas.microsoft.com/office/word/2010/wordprocessingInk" xmlns:wps="http://schemas.microsoft.com/office/word/2010/wordprocessingShape" mc:Ignorable="w14 wp14">
+<w:hdr xmlns:wpc="http://schemas.microsoft.com/office/word/2010/wordprocessingCanvas" xmlns:cx="http://schemas.microsoft.com/office/drawing/2014/chartex" xmlns:cx1="http://schemas.microsoft.com/office/drawing/2015/9/8/chartex" xmlns:cx2="http://schemas.microsoft.com/office/drawing/2015/10/21/chartex" xmlns:cx3="http://schemas.microsoft.com/office/drawing/2016/5/9/chartex" xmlns:cx4="http://schemas.microsoft.com/office/drawing/2016/5/10/chartex" xmlns:cx5="http://schemas.microsoft.com/office/drawing/2016/5/11/chartex" xmlns:cx6="http://schemas.microsoft.com/office/drawing/2016/5/12/chartex" xmlns:cx7="http://schemas.microsoft.com/office/drawing/2016/5/13/chartex" xmlns:cx8="http://schemas.microsoft.com/office/drawing/2016/5/14/chartex" xmlns:mc="http://schemas.openxmlformats.org/markup-compatibility/2006" xmlns:aink="http://schemas.microsoft.com/office/drawing/2016/ink" xmlns:am3d="http://schemas.microsoft.com/office/drawing/2017/model3d" xmlns:o="urn:schemas-microsoft-com:office:office" xmlns:r="http://schemas.openxmlformats.org/officeDocument/2006/relationships" xmlns:m="http://schemas.openxmlformats.org/officeDocument/2006/math" xmlns:v="urn:schemas-microsoft-com:vml" xmlns:wp14="http://schemas.microsoft.com/office/word/2010/wordprocessingDrawing" xmlns:wp="http://schemas.openxmlformats.org/drawingml/2006/wordprocessingDrawing" xmlns:w10="urn:schemas-microsoft-com:office:word" xmlns:w="http://schemas.openxmlformats.org/wordprocessingml/2006/main" xmlns:w14="http://schemas.microsoft.com/office/word/2010/wordml" xmlns:w15="http://schemas.microsoft.com/office/word/2012/wordml" xmlns:w16cex="http://schemas.microsoft.com/office/word/2018/wordml/cex" xmlns:w16cid="http://schemas.microsoft.com/office/word/2016/wordml/cid" xmlns:w16="http://schemas.microsoft.com/office/word/2018/wordml" xmlns:w16sdtdh="http://schemas.microsoft.com/office/word/2020/wordml/sdtdatahash" xmlns:w16se="http://schemas.microsoft.com/office/word/2015/wordml/symex" xmlns:wpg="http://schemas.microsoft.com/office/word/2010/wordprocessingGroup" xmlns:wpi="http://schemas.microsoft.com/office/word/2010/wordprocessingInk" xmlns:wne="http://schemas.microsoft.com/office/word/2006/wordml" xmlns:wps="http://schemas.microsoft.com/office/word/2010/wordprocessingShape" mc:Ignorable="w14 w15 w16se w16cid w16 w16cex w16sdtdh wp14">
   <w:p>
     <w:pPr>
       <w:pStyle w:val="Header"/>
@@ -249,7 +1153,7 @@
 </file>
 
 <file path=word/header2.xml><?xml version="1.0" encoding="utf-8"?>
-<w:hdr xmlns:m="http://schemas.openxmlformats.org/officeDocument/2006/math" xmlns:mc="http://schemas.openxmlformats.org/markup-compatibility/2006" xmlns:mo="http://schemas.microsoft.com/office/mac/office/2008/main" xmlns:mv="urn:schemas-microsoft-com:mac:vml" xmlns:o="urn:schemas-microsoft-com:office:office" xmlns:r="http://schemas.openxmlformats.org/officeDocument/2006/relationships" xmlns:v="urn:schemas-microsoft-com:vml" xmlns:w10="urn:schemas-microsoft-com:office:word" xmlns:w14="http://schemas.microsoft.com/office/word/2010/wordml" xmlns:w="http://schemas.openxmlformats.org/wordprocessingml/2006/main" xmlns:wne="http://schemas.microsoft.com/office/word/2006/wordml" xmlns:wp14="http://schemas.microsoft.com/office/word/2010/wordprocessingDrawing" xmlns:wp="http://schemas.openxmlformats.org/drawingml/2006/wordprocessingDrawing" xmlns:wpc="http://schemas.microsoft.com/office/word/2010/wordprocessingCanvas" xmlns:wpg="http://schemas.microsoft.com/office/word/2010/wordprocessingGroup" xmlns:wpi="http://schemas.microsoft.com/office/word/2010/wordprocessingInk" xmlns:wps="http://schemas.microsoft.com/office/word/2010/wordprocessingShape" mc:Ignorable="w14 wp14">
+<w:hdr xmlns:wpc="http://schemas.microsoft.com/office/word/2010/wordprocessingCanvas" xmlns:cx="http://schemas.microsoft.com/office/drawing/2014/chartex" xmlns:cx1="http://schemas.microsoft.com/office/drawing/2015/9/8/chartex" xmlns:cx2="http://schemas.microsoft.com/office/drawing/2015/10/21/chartex" xmlns:cx3="http://schemas.microsoft.com/office/drawing/2016/5/9/chartex" xmlns:cx4="http://schemas.microsoft.com/office/drawing/2016/5/10/chartex" xmlns:cx5="http://schemas.microsoft.com/office/drawing/2016/5/11/chartex" xmlns:cx6="http://schemas.microsoft.com/office/drawing/2016/5/12/chartex" xmlns:cx7="http://schemas.microsoft.com/office/drawing/2016/5/13/chartex" xmlns:cx8="http://schemas.microsoft.com/office/drawing/2016/5/14/chartex" xmlns:mc="http://schemas.openxmlformats.org/markup-compatibility/2006" xmlns:aink="http://schemas.microsoft.com/office/drawing/2016/ink" xmlns:am3d="http://schemas.microsoft.com/office/drawing/2017/model3d" xmlns:o="urn:schemas-microsoft-com:office:office" xmlns:r="http://schemas.openxmlformats.org/officeDocument/2006/relationships" xmlns:m="http://schemas.openxmlformats.org/officeDocument/2006/math" xmlns:v="urn:schemas-microsoft-com:vml" xmlns:wp14="http://schemas.microsoft.com/office/word/2010/wordprocessingDrawing" xmlns:wp="http://schemas.openxmlformats.org/drawingml/2006/wordprocessingDrawing" xmlns:w10="urn:schemas-microsoft-com:office:word" xmlns:w="http://schemas.openxmlformats.org/wordprocessingml/2006/main" xmlns:w14="http://schemas.microsoft.com/office/word/2010/wordml" xmlns:w15="http://schemas.microsoft.com/office/word/2012/wordml" xmlns:w16cex="http://schemas.microsoft.com/office/word/2018/wordml/cex" xmlns:w16cid="http://schemas.microsoft.com/office/word/2016/wordml/cid" xmlns:w16="http://schemas.microsoft.com/office/word/2018/wordml" xmlns:w16sdtdh="http://schemas.microsoft.com/office/word/2020/wordml/sdtdatahash" xmlns:w16se="http://schemas.microsoft.com/office/word/2015/wordml/symex" xmlns:wpg="http://schemas.microsoft.com/office/word/2010/wordprocessingGroup" xmlns:wpi="http://schemas.microsoft.com/office/word/2010/wordprocessingInk" xmlns:wne="http://schemas.microsoft.com/office/word/2006/wordml" xmlns:wps="http://schemas.microsoft.com/office/word/2010/wordprocessingShape" mc:Ignorable="w14 w15 w16se w16cid w16 w16cex w16sdtdh wp14">
   <w:p>
     <w:pPr>
       <w:pStyle w:val="Header"/>
@@ -259,7 +1163,7 @@
 </file>
 
 <file path=word/header3.xml><?xml version="1.0" encoding="utf-8"?>
-<w:hdr xmlns:m="http://schemas.openxmlformats.org/officeDocument/2006/math" xmlns:mc="http://schemas.openxmlformats.org/markup-compatibility/2006" xmlns:mo="http://schemas.microsoft.com/office/mac/office/2008/main" xmlns:mv="urn:schemas-microsoft-com:mac:vml" xmlns:o="urn:schemas-microsoft-com:office:office" xmlns:r="http://schemas.openxmlformats.org/officeDocument/2006/relationships" xmlns:v="urn:schemas-microsoft-com:vml" xmlns:w10="urn:schemas-microsoft-com:office:word" xmlns:w14="http://schemas.microsoft.com/office/word/2010/wordml" xmlns:w="http://schemas.openxmlformats.org/wordprocessingml/2006/main" xmlns:wne="http://schemas.microsoft.com/office/word/2006/wordml" xmlns:wp14="http://schemas.microsoft.com/office/word/2010/wordprocessingDrawing" xmlns:wp="http://schemas.openxmlformats.org/drawingml/2006/wordprocessingDrawing" xmlns:wpc="http://schemas.microsoft.com/office/word/2010/wordprocessingCanvas" xmlns:wpg="http://schemas.microsoft.com/office/word/2010/wordprocessingGroup" xmlns:wpi="http://schemas.microsoft.com/office/word/2010/wordprocessingInk" xmlns:wps="http://schemas.microsoft.com/office/word/2010/wordprocessingShape" mc:Ignorable="w14 wp14">
+<w:hdr xmlns:wpc="http://schemas.microsoft.com/office/word/2010/wordprocessingCanvas" xmlns:cx="http://schemas.microsoft.com/office/drawing/2014/chartex" xmlns:cx1="http://schemas.microsoft.com/office/drawing/2015/9/8/chartex" xmlns:cx2="http://schemas.microsoft.com/office/drawing/2015/10/21/chartex" xmlns:cx3="http://schemas.microsoft.com/office/drawing/2016/5/9/chartex" xmlns:cx4="http://schemas.microsoft.com/office/drawing/2016/5/10/chartex" xmlns:cx5="http://schemas.microsoft.com/office/drawing/2016/5/11/chartex" xmlns:cx6="http://schemas.microsoft.com/office/drawing/2016/5/12/chartex" xmlns:cx7="http://schemas.microsoft.com/office/drawing/2016/5/13/chartex" xmlns:cx8="http://schemas.microsoft.com/office/drawing/2016/5/14/chartex" xmlns:mc="http://schemas.openxmlformats.org/markup-compatibility/2006" xmlns:aink="http://schemas.microsoft.com/office/drawing/2016/ink" xmlns:am3d="http://schemas.microsoft.com/office/drawing/2017/model3d" xmlns:o="urn:schemas-microsoft-com:office:office" xmlns:r="http://schemas.openxmlformats.org/officeDocument/2006/relationships" xmlns:m="http://schemas.openxmlformats.org/officeDocument/2006/math" xmlns:v="urn:schemas-microsoft-com:vml" xmlns:wp14="http://schemas.microsoft.com/office/word/2010/wordprocessingDrawing" xmlns:wp="http://schemas.openxmlformats.org/drawingml/2006/wordprocessingDrawing" xmlns:w10="urn:schemas-microsoft-com:office:word" xmlns:w="http://schemas.openxmlformats.org/wordprocessingml/2006/main" xmlns:w14="http://schemas.microsoft.com/office/word/2010/wordml" xmlns:w15="http://schemas.microsoft.com/office/word/2012/wordml" xmlns:w16cex="http://schemas.microsoft.com/office/word/2018/wordml/cex" xmlns:w16cid="http://schemas.microsoft.com/office/word/2016/wordml/cid" xmlns:w16="http://schemas.microsoft.com/office/word/2018/wordml" xmlns:w16sdtdh="http://schemas.microsoft.com/office/word/2020/wordml/sdtdatahash" xmlns:w16se="http://schemas.microsoft.com/office/word/2015/wordml/symex" xmlns:wpg="http://schemas.microsoft.com/office/word/2010/wordprocessingGroup" xmlns:wpi="http://schemas.microsoft.com/office/word/2010/wordprocessingInk" xmlns:wne="http://schemas.microsoft.com/office/word/2006/wordml" xmlns:wps="http://schemas.microsoft.com/office/word/2010/wordprocessingShape" mc:Ignorable="w14 w15 w16se w16cid w16 w16cex w16sdtdh wp14">
   <w:p>
     <w:pPr>
       <w:pStyle w:val="Header"/>
@@ -271,118 +1175,6 @@
 <file path=word/numbering.xml><?xml version="1.0" encoding="utf-8"?>
 <w:numbering xmlns:wpc="http://schemas.microsoft.com/office/word/2010/wordprocessingCanvas" xmlns:cx="http://schemas.microsoft.com/office/drawing/2014/chartex" xmlns:cx1="http://schemas.microsoft.com/office/drawing/2015/9/8/chartex" xmlns:cx2="http://schemas.microsoft.com/office/drawing/2015/10/21/chartex" xmlns:cx3="http://schemas.microsoft.com/office/drawing/2016/5/9/chartex" xmlns:cx4="http://schemas.microsoft.com/office/drawing/2016/5/10/chartex" xmlns:cx5="http://schemas.microsoft.com/office/drawing/2016/5/11/chartex" xmlns:cx6="http://schemas.microsoft.com/office/drawing/2016/5/12/chartex" xmlns:cx7="http://schemas.microsoft.com/office/drawing/2016/5/13/chartex" xmlns:cx8="http://schemas.microsoft.com/office/drawing/2016/5/14/chartex" xmlns:mc="http://schemas.openxmlformats.org/markup-compatibility/2006" xmlns:aink="http://schemas.microsoft.com/office/drawing/2016/ink" xmlns:am3d="http://schemas.microsoft.com/office/drawing/2017/model3d" xmlns:o="urn:schemas-microsoft-com:office:office" xmlns:r="http://schemas.openxmlformats.org/officeDocument/2006/relationships" xmlns:m="http://schemas.openxmlformats.org/officeDocument/2006/math" xmlns:v="urn:schemas-microsoft-com:vml" xmlns:wp14="http://schemas.microsoft.com/office/word/2010/wordprocessingDrawing" xmlns:wp="http://schemas.openxmlformats.org/drawingml/2006/wordprocessingDrawing" xmlns:w10="urn:schemas-microsoft-com:office:word" xmlns:w="http://schemas.openxmlformats.org/wordprocessingml/2006/main" xmlns:w14="http://schemas.microsoft.com/office/word/2010/wordml" xmlns:w15="http://schemas.microsoft.com/office/word/2012/wordml" xmlns:w16cex="http://schemas.microsoft.com/office/word/2018/wordml/cex" xmlns:w16cid="http://schemas.microsoft.com/office/word/2016/wordml/cid" xmlns:w16="http://schemas.microsoft.com/office/word/2018/wordml" xmlns:w16sdtdh="http://schemas.microsoft.com/office/word/2020/wordml/sdtdatahash" xmlns:w16se="http://schemas.microsoft.com/office/word/2015/wordml/symex" xmlns:wpg="http://schemas.microsoft.com/office/word/2010/wordprocessingGroup" xmlns:wpi="http://schemas.microsoft.com/office/word/2010/wordprocessingInk" xmlns:wne="http://schemas.microsoft.com/office/word/2006/wordml" xmlns:wps="http://schemas.microsoft.com/office/word/2010/wordprocessingShape" mc:Ignorable="w14 w15 w16se w16cid w16 w16cex w16sdtdh wp14">
   <w:abstractNum w:abstractNumId="0" w15:restartNumberingAfterBreak="0">
-    <w:nsid w:val="073E10F3"/>
-    <w:multiLevelType w:val="hybridMultilevel"/>
-    <w:tmpl w:val="8504561E"/>
-    <w:lvl w:ilvl="0" w:tplc="9E56D504">
-      <w:numFmt w:val="bullet"/>
-      <w:lvlText w:val=""/>
-      <w:lvlJc w:val="left"/>
-      <w:pPr>
-        <w:ind w:left="495" w:hanging="360"/>
-      </w:pPr>
-      <w:rPr>
-        <w:rFonts w:ascii="Symbol" w:eastAsiaTheme="minorHAnsi" w:hAnsi="Symbol" w:cs="Helvetica" w:hint="default"/>
-      </w:rPr>
-    </w:lvl>
-    <w:lvl w:ilvl="1" w:tplc="04090003" w:tentative="1">
-      <w:start w:val="1"/>
-      <w:numFmt w:val="bullet"/>
-      <w:lvlText w:val="o"/>
-      <w:lvlJc w:val="left"/>
-      <w:pPr>
-        <w:ind w:left="1215" w:hanging="360"/>
-      </w:pPr>
-      <w:rPr>
-        <w:rFonts w:ascii="Courier New" w:hAnsi="Courier New" w:cs="Courier New" w:hint="default"/>
-      </w:rPr>
-    </w:lvl>
-    <w:lvl w:ilvl="2" w:tplc="04090005" w:tentative="1">
-      <w:start w:val="1"/>
-      <w:numFmt w:val="bullet"/>
-      <w:lvlText w:val=""/>
-      <w:lvlJc w:val="left"/>
-      <w:pPr>
-        <w:ind w:left="1935" w:hanging="360"/>
-      </w:pPr>
-      <w:rPr>
-        <w:rFonts w:ascii="Wingdings" w:hAnsi="Wingdings" w:hint="default"/>
-      </w:rPr>
-    </w:lvl>
-    <w:lvl w:ilvl="3" w:tplc="04090001" w:tentative="1">
-      <w:start w:val="1"/>
-      <w:numFmt w:val="bullet"/>
-      <w:lvlText w:val=""/>
-      <w:lvlJc w:val="left"/>
-      <w:pPr>
-        <w:ind w:left="2655" w:hanging="360"/>
-      </w:pPr>
-      <w:rPr>
-        <w:rFonts w:ascii="Symbol" w:hAnsi="Symbol" w:hint="default"/>
-      </w:rPr>
-    </w:lvl>
-    <w:lvl w:ilvl="4" w:tplc="04090003" w:tentative="1">
-      <w:start w:val="1"/>
-      <w:numFmt w:val="bullet"/>
-      <w:lvlText w:val="o"/>
-      <w:lvlJc w:val="left"/>
-      <w:pPr>
-        <w:ind w:left="3375" w:hanging="360"/>
-      </w:pPr>
-      <w:rPr>
-        <w:rFonts w:ascii="Courier New" w:hAnsi="Courier New" w:cs="Courier New" w:hint="default"/>
-      </w:rPr>
-    </w:lvl>
-    <w:lvl w:ilvl="5" w:tplc="04090005" w:tentative="1">
-      <w:start w:val="1"/>
-      <w:numFmt w:val="bullet"/>
-      <w:lvlText w:val=""/>
-      <w:lvlJc w:val="left"/>
-      <w:pPr>
-        <w:ind w:left="4095" w:hanging="360"/>
-      </w:pPr>
-      <w:rPr>
-        <w:rFonts w:ascii="Wingdings" w:hAnsi="Wingdings" w:hint="default"/>
-      </w:rPr>
-    </w:lvl>
-    <w:lvl w:ilvl="6" w:tplc="04090001" w:tentative="1">
-      <w:start w:val="1"/>
-      <w:numFmt w:val="bullet"/>
-      <w:lvlText w:val=""/>
-      <w:lvlJc w:val="left"/>
-      <w:pPr>
-        <w:ind w:left="4815" w:hanging="360"/>
-      </w:pPr>
-      <w:rPr>
-        <w:rFonts w:ascii="Symbol" w:hAnsi="Symbol" w:hint="default"/>
-      </w:rPr>
-    </w:lvl>
-    <w:lvl w:ilvl="7" w:tplc="04090003" w:tentative="1">
-      <w:start w:val="1"/>
-      <w:numFmt w:val="bullet"/>
-      <w:lvlText w:val="o"/>
-      <w:lvlJc w:val="left"/>
-      <w:pPr>
-        <w:ind w:left="5535" w:hanging="360"/>
-      </w:pPr>
-      <w:rPr>
-        <w:rFonts w:ascii="Courier New" w:hAnsi="Courier New" w:cs="Courier New" w:hint="default"/>
-      </w:rPr>
-    </w:lvl>
-    <w:lvl w:ilvl="8" w:tplc="04090005" w:tentative="1">
-      <w:start w:val="1"/>
-      <w:numFmt w:val="bullet"/>
-      <w:lvlText w:val=""/>
-      <w:lvlJc w:val="left"/>
-      <w:pPr>
-        <w:ind w:left="6255" w:hanging="360"/>
-      </w:pPr>
-      <w:rPr>
-        <w:rFonts w:ascii="Wingdings" w:hAnsi="Wingdings" w:hint="default"/>
-      </w:rPr>
-    </w:lvl>
-  </w:abstractNum>
-  <w:abstractNum w:abstractNumId="1" w15:restartNumberingAfterBreak="0">
     <w:nsid w:val="08C6366F"/>
     <w:multiLevelType w:val="hybridMultilevel"/>
     <w:tmpl w:val="D3561CAA"/>
@@ -469,120 +1261,7 @@
       </w:pPr>
     </w:lvl>
   </w:abstractNum>
-  <w:abstractNum w:abstractNumId="2" w15:restartNumberingAfterBreak="0">
-    <w:nsid w:val="09F353E3"/>
-    <w:multiLevelType w:val="hybridMultilevel"/>
-    <w:tmpl w:val="EE5CFEAC"/>
-    <w:lvl w:ilvl="0" w:tplc="04090001">
-      <w:start w:val="1"/>
-      <w:numFmt w:val="bullet"/>
-      <w:lvlText w:val=""/>
-      <w:lvlJc w:val="left"/>
-      <w:pPr>
-        <w:ind w:left="720" w:hanging="360"/>
-      </w:pPr>
-      <w:rPr>
-        <w:rFonts w:ascii="Symbol" w:hAnsi="Symbol" w:hint="default"/>
-      </w:rPr>
-    </w:lvl>
-    <w:lvl w:ilvl="1" w:tplc="04090003" w:tentative="1">
-      <w:start w:val="1"/>
-      <w:numFmt w:val="bullet"/>
-      <w:lvlText w:val="o"/>
-      <w:lvlJc w:val="left"/>
-      <w:pPr>
-        <w:ind w:left="1440" w:hanging="360"/>
-      </w:pPr>
-      <w:rPr>
-        <w:rFonts w:ascii="Courier New" w:hAnsi="Courier New" w:cs="Courier New" w:hint="default"/>
-      </w:rPr>
-    </w:lvl>
-    <w:lvl w:ilvl="2" w:tplc="04090005" w:tentative="1">
-      <w:start w:val="1"/>
-      <w:numFmt w:val="bullet"/>
-      <w:lvlText w:val=""/>
-      <w:lvlJc w:val="left"/>
-      <w:pPr>
-        <w:ind w:left="2160" w:hanging="360"/>
-      </w:pPr>
-      <w:rPr>
-        <w:rFonts w:ascii="Wingdings" w:hAnsi="Wingdings" w:hint="default"/>
-      </w:rPr>
-    </w:lvl>
-    <w:lvl w:ilvl="3" w:tplc="04090001" w:tentative="1">
-      <w:start w:val="1"/>
-      <w:numFmt w:val="bullet"/>
-      <w:lvlText w:val=""/>
-      <w:lvlJc w:val="left"/>
-      <w:pPr>
-        <w:ind w:left="2880" w:hanging="360"/>
-      </w:pPr>
-      <w:rPr>
-        <w:rFonts w:ascii="Symbol" w:hAnsi="Symbol" w:hint="default"/>
-      </w:rPr>
-    </w:lvl>
-    <w:lvl w:ilvl="4" w:tplc="04090003" w:tentative="1">
-      <w:start w:val="1"/>
-      <w:numFmt w:val="bullet"/>
-      <w:lvlText w:val="o"/>
-      <w:lvlJc w:val="left"/>
-      <w:pPr>
-        <w:ind w:left="3600" w:hanging="360"/>
-      </w:pPr>
-      <w:rPr>
-        <w:rFonts w:ascii="Courier New" w:hAnsi="Courier New" w:cs="Courier New" w:hint="default"/>
-      </w:rPr>
-    </w:lvl>
-    <w:lvl w:ilvl="5" w:tplc="04090005" w:tentative="1">
-      <w:start w:val="1"/>
-      <w:numFmt w:val="bullet"/>
-      <w:lvlText w:val=""/>
-      <w:lvlJc w:val="left"/>
-      <w:pPr>
-        <w:ind w:left="4320" w:hanging="360"/>
-      </w:pPr>
-      <w:rPr>
-        <w:rFonts w:ascii="Wingdings" w:hAnsi="Wingdings" w:hint="default"/>
-      </w:rPr>
-    </w:lvl>
-    <w:lvl w:ilvl="6" w:tplc="04090001" w:tentative="1">
-      <w:start w:val="1"/>
-      <w:numFmt w:val="bullet"/>
-      <w:lvlText w:val=""/>
-      <w:lvlJc w:val="left"/>
-      <w:pPr>
-        <w:ind w:left="5040" w:hanging="360"/>
-      </w:pPr>
-      <w:rPr>
-        <w:rFonts w:ascii="Symbol" w:hAnsi="Symbol" w:hint="default"/>
-      </w:rPr>
-    </w:lvl>
-    <w:lvl w:ilvl="7" w:tplc="04090003" w:tentative="1">
-      <w:start w:val="1"/>
-      <w:numFmt w:val="bullet"/>
-      <w:lvlText w:val="o"/>
-      <w:lvlJc w:val="left"/>
-      <w:pPr>
-        <w:ind w:left="5760" w:hanging="360"/>
-      </w:pPr>
-      <w:rPr>
-        <w:rFonts w:ascii="Courier New" w:hAnsi="Courier New" w:cs="Courier New" w:hint="default"/>
-      </w:rPr>
-    </w:lvl>
-    <w:lvl w:ilvl="8" w:tplc="04090005" w:tentative="1">
-      <w:start w:val="1"/>
-      <w:numFmt w:val="bullet"/>
-      <w:lvlText w:val=""/>
-      <w:lvlJc w:val="left"/>
-      <w:pPr>
-        <w:ind w:left="6480" w:hanging="360"/>
-      </w:pPr>
-      <w:rPr>
-        <w:rFonts w:ascii="Wingdings" w:hAnsi="Wingdings" w:hint="default"/>
-      </w:rPr>
-    </w:lvl>
-  </w:abstractNum>
-  <w:abstractNum w:abstractNumId="3" w15:restartNumberingAfterBreak="0">
+  <w:abstractNum w:abstractNumId="1" w15:restartNumberingAfterBreak="0">
     <w:nsid w:val="0C357DD6"/>
     <w:multiLevelType w:val="hybridMultilevel"/>
     <w:tmpl w:val="D83AD7E4"/>
@@ -673,7 +1352,7 @@
       </w:pPr>
     </w:lvl>
   </w:abstractNum>
-  <w:abstractNum w:abstractNumId="4" w15:restartNumberingAfterBreak="0">
+  <w:abstractNum w:abstractNumId="2" w15:restartNumberingAfterBreak="0">
     <w:nsid w:val="0DEA069D"/>
     <w:multiLevelType w:val="multilevel"/>
     <w:tmpl w:val="450C4EF6"/>
@@ -814,164 +1493,7 @@
       </w:rPr>
     </w:lvl>
   </w:abstractNum>
-  <w:abstractNum w:abstractNumId="5" w15:restartNumberingAfterBreak="0">
-    <w:nsid w:val="1323523E"/>
-    <w:multiLevelType w:val="multilevel"/>
-    <w:tmpl w:val="873C83DA"/>
-    <w:lvl w:ilvl="0">
-      <w:start w:val="1"/>
-      <w:numFmt w:val="decimal"/>
-      <w:suff w:val="space"/>
-      <w:lvlText w:val="Step %1:"/>
-      <w:lvlJc w:val="left"/>
-      <w:pPr>
-        <w:ind w:left="0" w:firstLine="0"/>
-      </w:pPr>
-      <w:rPr>
-        <w:rFonts w:hint="default"/>
-        <w:b w:val="0"/>
-        <w:bCs w:val="0"/>
-        <w:i w:val="0"/>
-        <w:iCs w:val="0"/>
-        <w:caps w:val="0"/>
-        <w:smallCaps w:val="0"/>
-        <w:strike w:val="0"/>
-        <w:dstrike w:val="0"/>
-        <w:noProof w:val="0"/>
-        <w:vanish w:val="0"/>
-        <w:color w:val="0A2A78"/>
-        <w:spacing w:val="0"/>
-        <w:kern w:val="0"/>
-        <w:position w:val="0"/>
-        <w:u w:val="none"/>
-        <w:effect w:val="none"/>
-        <w:vertAlign w:val="baseline"/>
-        <w:em w:val="none"/>
-        <w:specVanish w:val="0"/>
-        <w14:glow w14:rad="0">
-          <w14:srgbClr w14:val="000000"/>
-        </w14:glow>
-        <w14:shadow w14:blurRad="0" w14:dist="0" w14:dir="0" w14:sx="0" w14:sy="0" w14:kx="0" w14:ky="0" w14:algn="none">
-          <w14:srgbClr w14:val="000000"/>
-        </w14:shadow>
-        <w14:reflection w14:blurRad="0" w14:stA="0" w14:stPos="0" w14:endA="0" w14:endPos="0" w14:dist="0" w14:dir="0" w14:fadeDir="0" w14:sx="0" w14:sy="0" w14:kx="0" w14:ky="0" w14:algn="none"/>
-        <w14:textOutline w14:w="0" w14:cap="rnd" w14:cmpd="sng" w14:algn="ctr">
-          <w14:noFill/>
-          <w14:prstDash w14:val="solid"/>
-          <w14:bevel/>
-        </w14:textOutline>
-        <w14:scene3d>
-          <w14:camera w14:prst="orthographicFront"/>
-          <w14:lightRig w14:rig="threePt" w14:dir="t">
-            <w14:rot w14:lat="0" w14:lon="0" w14:rev="0"/>
-          </w14:lightRig>
-        </w14:scene3d>
-        <w14:props3d w14:extrusionH="0" w14:contourW="0" w14:prstMaterial="none"/>
-        <w14:ligatures w14:val="none"/>
-        <w14:numForm w14:val="default"/>
-        <w14:numSpacing w14:val="default"/>
-        <w14:stylisticSets/>
-        <w14:cntxtAlts w14:val="0"/>
-      </w:rPr>
-    </w:lvl>
-    <w:lvl w:ilvl="1">
-      <w:start w:val="1"/>
-      <w:numFmt w:val="lowerLetter"/>
-      <w:lvlText w:val="%2."/>
-      <w:lvlJc w:val="left"/>
-      <w:pPr>
-        <w:ind w:left="1440" w:hanging="360"/>
-      </w:pPr>
-      <w:rPr>
-        <w:rFonts w:hint="default"/>
-      </w:rPr>
-    </w:lvl>
-    <w:lvl w:ilvl="2">
-      <w:start w:val="1"/>
-      <w:numFmt w:val="lowerRoman"/>
-      <w:lvlText w:val="%3."/>
-      <w:lvlJc w:val="right"/>
-      <w:pPr>
-        <w:ind w:left="2160" w:hanging="180"/>
-      </w:pPr>
-      <w:rPr>
-        <w:rFonts w:hint="default"/>
-      </w:rPr>
-    </w:lvl>
-    <w:lvl w:ilvl="3">
-      <w:start w:val="1"/>
-      <w:numFmt w:val="decimal"/>
-      <w:lvlText w:val="%4."/>
-      <w:lvlJc w:val="left"/>
-      <w:pPr>
-        <w:ind w:left="2880" w:hanging="360"/>
-      </w:pPr>
-      <w:rPr>
-        <w:rFonts w:hint="default"/>
-      </w:rPr>
-    </w:lvl>
-    <w:lvl w:ilvl="4">
-      <w:start w:val="1"/>
-      <w:numFmt w:val="lowerLetter"/>
-      <w:lvlText w:val="%5."/>
-      <w:lvlJc w:val="left"/>
-      <w:pPr>
-        <w:ind w:left="3600" w:hanging="360"/>
-      </w:pPr>
-      <w:rPr>
-        <w:rFonts w:hint="default"/>
-      </w:rPr>
-    </w:lvl>
-    <w:lvl w:ilvl="5">
-      <w:start w:val="1"/>
-      <w:numFmt w:val="lowerRoman"/>
-      <w:lvlText w:val="%6."/>
-      <w:lvlJc w:val="right"/>
-      <w:pPr>
-        <w:ind w:left="4320" w:hanging="180"/>
-      </w:pPr>
-      <w:rPr>
-        <w:rFonts w:hint="default"/>
-      </w:rPr>
-    </w:lvl>
-    <w:lvl w:ilvl="6">
-      <w:start w:val="1"/>
-      <w:numFmt w:val="decimal"/>
-      <w:lvlText w:val="%7."/>
-      <w:lvlJc w:val="left"/>
-      <w:pPr>
-        <w:ind w:left="5040" w:hanging="360"/>
-      </w:pPr>
-      <w:rPr>
-        <w:rFonts w:hint="default"/>
-      </w:rPr>
-    </w:lvl>
-    <w:lvl w:ilvl="7">
-      <w:start w:val="1"/>
-      <w:numFmt w:val="lowerLetter"/>
-      <w:lvlText w:val="%8."/>
-      <w:lvlJc w:val="left"/>
-      <w:pPr>
-        <w:ind w:left="5760" w:hanging="360"/>
-      </w:pPr>
-      <w:rPr>
-        <w:rFonts w:hint="default"/>
-      </w:rPr>
-    </w:lvl>
-    <w:lvl w:ilvl="8">
-      <w:start w:val="1"/>
-      <w:numFmt w:val="lowerRoman"/>
-      <w:lvlText w:val="%9."/>
-      <w:lvlJc w:val="right"/>
-      <w:pPr>
-        <w:ind w:left="6480" w:hanging="180"/>
-      </w:pPr>
-      <w:rPr>
-        <w:rFonts w:hint="default"/>
-      </w:rPr>
-    </w:lvl>
-  </w:abstractNum>
-  <w:abstractNum w:abstractNumId="6" w15:restartNumberingAfterBreak="0">
+  <w:abstractNum w:abstractNumId="3" w15:restartNumberingAfterBreak="0">
     <w:nsid w:val="15510218"/>
     <w:multiLevelType w:val="hybridMultilevel"/>
     <w:tmpl w:val="8EF49D20"/>
@@ -1061,93 +1583,7 @@
       </w:pPr>
     </w:lvl>
   </w:abstractNum>
-  <w:abstractNum w:abstractNumId="7" w15:restartNumberingAfterBreak="0">
-    <w:nsid w:val="1D6A1174"/>
-    <w:multiLevelType w:val="hybridMultilevel"/>
-    <w:tmpl w:val="826CC7B4"/>
-    <w:lvl w:ilvl="0" w:tplc="0409000F">
-      <w:start w:val="1"/>
-      <w:numFmt w:val="decimal"/>
-      <w:lvlText w:val="%1."/>
-      <w:lvlJc w:val="left"/>
-      <w:pPr>
-        <w:ind w:left="720" w:hanging="360"/>
-      </w:pPr>
-    </w:lvl>
-    <w:lvl w:ilvl="1" w:tplc="04090019" w:tentative="1">
-      <w:start w:val="1"/>
-      <w:numFmt w:val="lowerLetter"/>
-      <w:lvlText w:val="%2."/>
-      <w:lvlJc w:val="left"/>
-      <w:pPr>
-        <w:ind w:left="1440" w:hanging="360"/>
-      </w:pPr>
-    </w:lvl>
-    <w:lvl w:ilvl="2" w:tplc="0409001B" w:tentative="1">
-      <w:start w:val="1"/>
-      <w:numFmt w:val="lowerRoman"/>
-      <w:lvlText w:val="%3."/>
-      <w:lvlJc w:val="right"/>
-      <w:pPr>
-        <w:ind w:left="2160" w:hanging="180"/>
-      </w:pPr>
-    </w:lvl>
-    <w:lvl w:ilvl="3" w:tplc="0409000F" w:tentative="1">
-      <w:start w:val="1"/>
-      <w:numFmt w:val="decimal"/>
-      <w:lvlText w:val="%4."/>
-      <w:lvlJc w:val="left"/>
-      <w:pPr>
-        <w:ind w:left="2880" w:hanging="360"/>
-      </w:pPr>
-    </w:lvl>
-    <w:lvl w:ilvl="4" w:tplc="04090019" w:tentative="1">
-      <w:start w:val="1"/>
-      <w:numFmt w:val="lowerLetter"/>
-      <w:lvlText w:val="%5."/>
-      <w:lvlJc w:val="left"/>
-      <w:pPr>
-        <w:ind w:left="3600" w:hanging="360"/>
-      </w:pPr>
-    </w:lvl>
-    <w:lvl w:ilvl="5" w:tplc="0409001B" w:tentative="1">
-      <w:start w:val="1"/>
-      <w:numFmt w:val="lowerRoman"/>
-      <w:lvlText w:val="%6."/>
-      <w:lvlJc w:val="right"/>
-      <w:pPr>
-        <w:ind w:left="4320" w:hanging="180"/>
-      </w:pPr>
-    </w:lvl>
-    <w:lvl w:ilvl="6" w:tplc="0409000F" w:tentative="1">
-      <w:start w:val="1"/>
-      <w:numFmt w:val="decimal"/>
-      <w:lvlText w:val="%7."/>
-      <w:lvlJc w:val="left"/>
-      <w:pPr>
-        <w:ind w:left="5040" w:hanging="360"/>
-      </w:pPr>
-    </w:lvl>
-    <w:lvl w:ilvl="7" w:tplc="04090019" w:tentative="1">
-      <w:start w:val="1"/>
-      <w:numFmt w:val="lowerLetter"/>
-      <w:lvlText w:val="%8."/>
-      <w:lvlJc w:val="left"/>
-      <w:pPr>
-        <w:ind w:left="5760" w:hanging="360"/>
-      </w:pPr>
-    </w:lvl>
-    <w:lvl w:ilvl="8" w:tplc="0409001B" w:tentative="1">
-      <w:start w:val="1"/>
-      <w:numFmt w:val="lowerRoman"/>
-      <w:lvlText w:val="%9."/>
-      <w:lvlJc w:val="right"/>
-      <w:pPr>
-        <w:ind w:left="6480" w:hanging="180"/>
-      </w:pPr>
-    </w:lvl>
-  </w:abstractNum>
-  <w:abstractNum w:abstractNumId="8" w15:restartNumberingAfterBreak="0">
+  <w:abstractNum w:abstractNumId="4" w15:restartNumberingAfterBreak="0">
     <w:nsid w:val="253D4794"/>
     <w:multiLevelType w:val="multilevel"/>
     <w:tmpl w:val="8C80AB36"/>
@@ -1260,120 +1696,7 @@
       </w:rPr>
     </w:lvl>
   </w:abstractNum>
-  <w:abstractNum w:abstractNumId="9" w15:restartNumberingAfterBreak="0">
-    <w:nsid w:val="25474D03"/>
-    <w:multiLevelType w:val="hybridMultilevel"/>
-    <w:tmpl w:val="7046A8AE"/>
-    <w:lvl w:ilvl="0" w:tplc="04090003">
-      <w:start w:val="1"/>
-      <w:numFmt w:val="bullet"/>
-      <w:lvlText w:val="o"/>
-      <w:lvlJc w:val="left"/>
-      <w:pPr>
-        <w:ind w:left="720" w:hanging="360"/>
-      </w:pPr>
-      <w:rPr>
-        <w:rFonts w:ascii="Courier New" w:hAnsi="Courier New" w:cs="Courier New" w:hint="default"/>
-      </w:rPr>
-    </w:lvl>
-    <w:lvl w:ilvl="1" w:tplc="04090003" w:tentative="1">
-      <w:start w:val="1"/>
-      <w:numFmt w:val="bullet"/>
-      <w:lvlText w:val="o"/>
-      <w:lvlJc w:val="left"/>
-      <w:pPr>
-        <w:ind w:left="1440" w:hanging="360"/>
-      </w:pPr>
-      <w:rPr>
-        <w:rFonts w:ascii="Courier New" w:hAnsi="Courier New" w:cs="Courier New" w:hint="default"/>
-      </w:rPr>
-    </w:lvl>
-    <w:lvl w:ilvl="2" w:tplc="04090005" w:tentative="1">
-      <w:start w:val="1"/>
-      <w:numFmt w:val="bullet"/>
-      <w:lvlText w:val=""/>
-      <w:lvlJc w:val="left"/>
-      <w:pPr>
-        <w:ind w:left="2160" w:hanging="360"/>
-      </w:pPr>
-      <w:rPr>
-        <w:rFonts w:ascii="Wingdings" w:hAnsi="Wingdings" w:hint="default"/>
-      </w:rPr>
-    </w:lvl>
-    <w:lvl w:ilvl="3" w:tplc="04090001" w:tentative="1">
-      <w:start w:val="1"/>
-      <w:numFmt w:val="bullet"/>
-      <w:lvlText w:val=""/>
-      <w:lvlJc w:val="left"/>
-      <w:pPr>
-        <w:ind w:left="2880" w:hanging="360"/>
-      </w:pPr>
-      <w:rPr>
-        <w:rFonts w:ascii="Symbol" w:hAnsi="Symbol" w:hint="default"/>
-      </w:rPr>
-    </w:lvl>
-    <w:lvl w:ilvl="4" w:tplc="04090003" w:tentative="1">
-      <w:start w:val="1"/>
-      <w:numFmt w:val="bullet"/>
-      <w:lvlText w:val="o"/>
-      <w:lvlJc w:val="left"/>
-      <w:pPr>
-        <w:ind w:left="3600" w:hanging="360"/>
-      </w:pPr>
-      <w:rPr>
-        <w:rFonts w:ascii="Courier New" w:hAnsi="Courier New" w:cs="Courier New" w:hint="default"/>
-      </w:rPr>
-    </w:lvl>
-    <w:lvl w:ilvl="5" w:tplc="04090005" w:tentative="1">
-      <w:start w:val="1"/>
-      <w:numFmt w:val="bullet"/>
-      <w:lvlText w:val=""/>
-      <w:lvlJc w:val="left"/>
-      <w:pPr>
-        <w:ind w:left="4320" w:hanging="360"/>
-      </w:pPr>
-      <w:rPr>
-        <w:rFonts w:ascii="Wingdings" w:hAnsi="Wingdings" w:hint="default"/>
-      </w:rPr>
-    </w:lvl>
-    <w:lvl w:ilvl="6" w:tplc="04090001" w:tentative="1">
-      <w:start w:val="1"/>
-      <w:numFmt w:val="bullet"/>
-      <w:lvlText w:val=""/>
-      <w:lvlJc w:val="left"/>
-      <w:pPr>
-        <w:ind w:left="5040" w:hanging="360"/>
-      </w:pPr>
-      <w:rPr>
-        <w:rFonts w:ascii="Symbol" w:hAnsi="Symbol" w:hint="default"/>
-      </w:rPr>
-    </w:lvl>
-    <w:lvl w:ilvl="7" w:tplc="04090003" w:tentative="1">
-      <w:start w:val="1"/>
-      <w:numFmt w:val="bullet"/>
-      <w:lvlText w:val="o"/>
-      <w:lvlJc w:val="left"/>
-      <w:pPr>
-        <w:ind w:left="5760" w:hanging="360"/>
-      </w:pPr>
-      <w:rPr>
-        <w:rFonts w:ascii="Courier New" w:hAnsi="Courier New" w:cs="Courier New" w:hint="default"/>
-      </w:rPr>
-    </w:lvl>
-    <w:lvl w:ilvl="8" w:tplc="04090005" w:tentative="1">
-      <w:start w:val="1"/>
-      <w:numFmt w:val="bullet"/>
-      <w:lvlText w:val=""/>
-      <w:lvlJc w:val="left"/>
-      <w:pPr>
-        <w:ind w:left="6480" w:hanging="360"/>
-      </w:pPr>
-      <w:rPr>
-        <w:rFonts w:ascii="Wingdings" w:hAnsi="Wingdings" w:hint="default"/>
-      </w:rPr>
-    </w:lvl>
-  </w:abstractNum>
-  <w:abstractNum w:abstractNumId="10" w15:restartNumberingAfterBreak="0">
+  <w:abstractNum w:abstractNumId="5" w15:restartNumberingAfterBreak="0">
     <w:nsid w:val="27FF20A5"/>
     <w:multiLevelType w:val="hybridMultilevel"/>
     <w:tmpl w:val="9036D3D8"/>
@@ -1488,7 +1811,7 @@
       </w:rPr>
     </w:lvl>
   </w:abstractNum>
-  <w:abstractNum w:abstractNumId="11" w15:restartNumberingAfterBreak="0">
+  <w:abstractNum w:abstractNumId="6" w15:restartNumberingAfterBreak="0">
     <w:nsid w:val="296F3872"/>
     <w:multiLevelType w:val="hybridMultilevel"/>
     <w:tmpl w:val="5E9E6A2E"/>
@@ -1602,233 +1925,7 @@
       </w:rPr>
     </w:lvl>
   </w:abstractNum>
-  <w:abstractNum w:abstractNumId="12" w15:restartNumberingAfterBreak="0">
-    <w:nsid w:val="3BB67316"/>
-    <w:multiLevelType w:val="hybridMultilevel"/>
-    <w:tmpl w:val="D2A20BEA"/>
-    <w:lvl w:ilvl="0" w:tplc="04090001">
-      <w:start w:val="1"/>
-      <w:numFmt w:val="bullet"/>
-      <w:lvlText w:val=""/>
-      <w:lvlJc w:val="left"/>
-      <w:pPr>
-        <w:ind w:left="720" w:hanging="360"/>
-      </w:pPr>
-      <w:rPr>
-        <w:rFonts w:ascii="Symbol" w:hAnsi="Symbol" w:hint="default"/>
-      </w:rPr>
-    </w:lvl>
-    <w:lvl w:ilvl="1" w:tplc="04090003" w:tentative="1">
-      <w:start w:val="1"/>
-      <w:numFmt w:val="bullet"/>
-      <w:lvlText w:val="o"/>
-      <w:lvlJc w:val="left"/>
-      <w:pPr>
-        <w:ind w:left="1440" w:hanging="360"/>
-      </w:pPr>
-      <w:rPr>
-        <w:rFonts w:ascii="Courier New" w:hAnsi="Courier New" w:cs="Courier New" w:hint="default"/>
-      </w:rPr>
-    </w:lvl>
-    <w:lvl w:ilvl="2" w:tplc="04090005" w:tentative="1">
-      <w:start w:val="1"/>
-      <w:numFmt w:val="bullet"/>
-      <w:lvlText w:val=""/>
-      <w:lvlJc w:val="left"/>
-      <w:pPr>
-        <w:ind w:left="2160" w:hanging="360"/>
-      </w:pPr>
-      <w:rPr>
-        <w:rFonts w:ascii="Wingdings" w:hAnsi="Wingdings" w:hint="default"/>
-      </w:rPr>
-    </w:lvl>
-    <w:lvl w:ilvl="3" w:tplc="04090001" w:tentative="1">
-      <w:start w:val="1"/>
-      <w:numFmt w:val="bullet"/>
-      <w:lvlText w:val=""/>
-      <w:lvlJc w:val="left"/>
-      <w:pPr>
-        <w:ind w:left="2880" w:hanging="360"/>
-      </w:pPr>
-      <w:rPr>
-        <w:rFonts w:ascii="Symbol" w:hAnsi="Symbol" w:hint="default"/>
-      </w:rPr>
-    </w:lvl>
-    <w:lvl w:ilvl="4" w:tplc="04090003" w:tentative="1">
-      <w:start w:val="1"/>
-      <w:numFmt w:val="bullet"/>
-      <w:lvlText w:val="o"/>
-      <w:lvlJc w:val="left"/>
-      <w:pPr>
-        <w:ind w:left="3600" w:hanging="360"/>
-      </w:pPr>
-      <w:rPr>
-        <w:rFonts w:ascii="Courier New" w:hAnsi="Courier New" w:cs="Courier New" w:hint="default"/>
-      </w:rPr>
-    </w:lvl>
-    <w:lvl w:ilvl="5" w:tplc="04090005" w:tentative="1">
-      <w:start w:val="1"/>
-      <w:numFmt w:val="bullet"/>
-      <w:lvlText w:val=""/>
-      <w:lvlJc w:val="left"/>
-      <w:pPr>
-        <w:ind w:left="4320" w:hanging="360"/>
-      </w:pPr>
-      <w:rPr>
-        <w:rFonts w:ascii="Wingdings" w:hAnsi="Wingdings" w:hint="default"/>
-      </w:rPr>
-    </w:lvl>
-    <w:lvl w:ilvl="6" w:tplc="04090001" w:tentative="1">
-      <w:start w:val="1"/>
-      <w:numFmt w:val="bullet"/>
-      <w:lvlText w:val=""/>
-      <w:lvlJc w:val="left"/>
-      <w:pPr>
-        <w:ind w:left="5040" w:hanging="360"/>
-      </w:pPr>
-      <w:rPr>
-        <w:rFonts w:ascii="Symbol" w:hAnsi="Symbol" w:hint="default"/>
-      </w:rPr>
-    </w:lvl>
-    <w:lvl w:ilvl="7" w:tplc="04090003" w:tentative="1">
-      <w:start w:val="1"/>
-      <w:numFmt w:val="bullet"/>
-      <w:lvlText w:val="o"/>
-      <w:lvlJc w:val="left"/>
-      <w:pPr>
-        <w:ind w:left="5760" w:hanging="360"/>
-      </w:pPr>
-      <w:rPr>
-        <w:rFonts w:ascii="Courier New" w:hAnsi="Courier New" w:cs="Courier New" w:hint="default"/>
-      </w:rPr>
-    </w:lvl>
-    <w:lvl w:ilvl="8" w:tplc="04090005" w:tentative="1">
-      <w:start w:val="1"/>
-      <w:numFmt w:val="bullet"/>
-      <w:lvlText w:val=""/>
-      <w:lvlJc w:val="left"/>
-      <w:pPr>
-        <w:ind w:left="6480" w:hanging="360"/>
-      </w:pPr>
-      <w:rPr>
-        <w:rFonts w:ascii="Wingdings" w:hAnsi="Wingdings" w:hint="default"/>
-      </w:rPr>
-    </w:lvl>
-  </w:abstractNum>
-  <w:abstractNum w:abstractNumId="13" w15:restartNumberingAfterBreak="0">
-    <w:nsid w:val="416740F3"/>
-    <w:multiLevelType w:val="hybridMultilevel"/>
-    <w:tmpl w:val="F012AB78"/>
-    <w:lvl w:ilvl="0" w:tplc="04090001">
-      <w:start w:val="1"/>
-      <w:numFmt w:val="bullet"/>
-      <w:lvlText w:val=""/>
-      <w:lvlJc w:val="left"/>
-      <w:pPr>
-        <w:ind w:left="720" w:hanging="360"/>
-      </w:pPr>
-      <w:rPr>
-        <w:rFonts w:ascii="Symbol" w:hAnsi="Symbol" w:hint="default"/>
-      </w:rPr>
-    </w:lvl>
-    <w:lvl w:ilvl="1" w:tplc="04090003" w:tentative="1">
-      <w:start w:val="1"/>
-      <w:numFmt w:val="bullet"/>
-      <w:lvlText w:val="o"/>
-      <w:lvlJc w:val="left"/>
-      <w:pPr>
-        <w:ind w:left="1440" w:hanging="360"/>
-      </w:pPr>
-      <w:rPr>
-        <w:rFonts w:ascii="Courier New" w:hAnsi="Courier New" w:cs="Courier New" w:hint="default"/>
-      </w:rPr>
-    </w:lvl>
-    <w:lvl w:ilvl="2" w:tplc="04090005" w:tentative="1">
-      <w:start w:val="1"/>
-      <w:numFmt w:val="bullet"/>
-      <w:lvlText w:val=""/>
-      <w:lvlJc w:val="left"/>
-      <w:pPr>
-        <w:ind w:left="2160" w:hanging="360"/>
-      </w:pPr>
-      <w:rPr>
-        <w:rFonts w:ascii="Wingdings" w:hAnsi="Wingdings" w:hint="default"/>
-      </w:rPr>
-    </w:lvl>
-    <w:lvl w:ilvl="3" w:tplc="04090001" w:tentative="1">
-      <w:start w:val="1"/>
-      <w:numFmt w:val="bullet"/>
-      <w:lvlText w:val=""/>
-      <w:lvlJc w:val="left"/>
-      <w:pPr>
-        <w:ind w:left="2880" w:hanging="360"/>
-      </w:pPr>
-      <w:rPr>
-        <w:rFonts w:ascii="Symbol" w:hAnsi="Symbol" w:hint="default"/>
-      </w:rPr>
-    </w:lvl>
-    <w:lvl w:ilvl="4" w:tplc="04090003" w:tentative="1">
-      <w:start w:val="1"/>
-      <w:numFmt w:val="bullet"/>
-      <w:lvlText w:val="o"/>
-      <w:lvlJc w:val="left"/>
-      <w:pPr>
-        <w:ind w:left="3600" w:hanging="360"/>
-      </w:pPr>
-      <w:rPr>
-        <w:rFonts w:ascii="Courier New" w:hAnsi="Courier New" w:cs="Courier New" w:hint="default"/>
-      </w:rPr>
-    </w:lvl>
-    <w:lvl w:ilvl="5" w:tplc="04090005" w:tentative="1">
-      <w:start w:val="1"/>
-      <w:numFmt w:val="bullet"/>
-      <w:lvlText w:val=""/>
-      <w:lvlJc w:val="left"/>
-      <w:pPr>
-        <w:ind w:left="4320" w:hanging="360"/>
-      </w:pPr>
-      <w:rPr>
-        <w:rFonts w:ascii="Wingdings" w:hAnsi="Wingdings" w:hint="default"/>
-      </w:rPr>
-    </w:lvl>
-    <w:lvl w:ilvl="6" w:tplc="04090001" w:tentative="1">
-      <w:start w:val="1"/>
-      <w:numFmt w:val="bullet"/>
-      <w:lvlText w:val=""/>
-      <w:lvlJc w:val="left"/>
-      <w:pPr>
-        <w:ind w:left="5040" w:hanging="360"/>
-      </w:pPr>
-      <w:rPr>
-        <w:rFonts w:ascii="Symbol" w:hAnsi="Symbol" w:hint="default"/>
-      </w:rPr>
-    </w:lvl>
-    <w:lvl w:ilvl="7" w:tplc="04090003" w:tentative="1">
-      <w:start w:val="1"/>
-      <w:numFmt w:val="bullet"/>
-      <w:lvlText w:val="o"/>
-      <w:lvlJc w:val="left"/>
-      <w:pPr>
-        <w:ind w:left="5760" w:hanging="360"/>
-      </w:pPr>
-      <w:rPr>
-        <w:rFonts w:ascii="Courier New" w:hAnsi="Courier New" w:cs="Courier New" w:hint="default"/>
-      </w:rPr>
-    </w:lvl>
-    <w:lvl w:ilvl="8" w:tplc="04090005" w:tentative="1">
-      <w:start w:val="1"/>
-      <w:numFmt w:val="bullet"/>
-      <w:lvlText w:val=""/>
-      <w:lvlJc w:val="left"/>
-      <w:pPr>
-        <w:ind w:left="6480" w:hanging="360"/>
-      </w:pPr>
-      <w:rPr>
-        <w:rFonts w:ascii="Wingdings" w:hAnsi="Wingdings" w:hint="default"/>
-      </w:rPr>
-    </w:lvl>
-  </w:abstractNum>
-  <w:abstractNum w:abstractNumId="14" w15:restartNumberingAfterBreak="0">
+  <w:abstractNum w:abstractNumId="7" w15:restartNumberingAfterBreak="0">
     <w:nsid w:val="4803540D"/>
     <w:multiLevelType w:val="hybridMultilevel"/>
     <w:tmpl w:val="CC58063A"/>
@@ -1942,7 +2039,7 @@
       </w:rPr>
     </w:lvl>
   </w:abstractNum>
-  <w:abstractNum w:abstractNumId="15" w15:restartNumberingAfterBreak="0">
+  <w:abstractNum w:abstractNumId="8" w15:restartNumberingAfterBreak="0">
     <w:nsid w:val="492F4D8F"/>
     <w:multiLevelType w:val="hybridMultilevel"/>
     <w:tmpl w:val="F62C94DE"/>
@@ -2056,233 +2153,7 @@
       </w:rPr>
     </w:lvl>
   </w:abstractNum>
-  <w:abstractNum w:abstractNumId="16" w15:restartNumberingAfterBreak="0">
-    <w:nsid w:val="527D4778"/>
-    <w:multiLevelType w:val="hybridMultilevel"/>
-    <w:tmpl w:val="EE8038B2"/>
-    <w:lvl w:ilvl="0" w:tplc="04090001">
-      <w:start w:val="1"/>
-      <w:numFmt w:val="bullet"/>
-      <w:lvlText w:val=""/>
-      <w:lvlJc w:val="left"/>
-      <w:pPr>
-        <w:ind w:left="720" w:hanging="360"/>
-      </w:pPr>
-      <w:rPr>
-        <w:rFonts w:ascii="Symbol" w:hAnsi="Symbol" w:hint="default"/>
-      </w:rPr>
-    </w:lvl>
-    <w:lvl w:ilvl="1" w:tplc="04090003" w:tentative="1">
-      <w:start w:val="1"/>
-      <w:numFmt w:val="bullet"/>
-      <w:lvlText w:val="o"/>
-      <w:lvlJc w:val="left"/>
-      <w:pPr>
-        <w:ind w:left="1440" w:hanging="360"/>
-      </w:pPr>
-      <w:rPr>
-        <w:rFonts w:ascii="Courier New" w:hAnsi="Courier New" w:cs="Courier New" w:hint="default"/>
-      </w:rPr>
-    </w:lvl>
-    <w:lvl w:ilvl="2" w:tplc="04090005" w:tentative="1">
-      <w:start w:val="1"/>
-      <w:numFmt w:val="bullet"/>
-      <w:lvlText w:val=""/>
-      <w:lvlJc w:val="left"/>
-      <w:pPr>
-        <w:ind w:left="2160" w:hanging="360"/>
-      </w:pPr>
-      <w:rPr>
-        <w:rFonts w:ascii="Wingdings" w:hAnsi="Wingdings" w:hint="default"/>
-      </w:rPr>
-    </w:lvl>
-    <w:lvl w:ilvl="3" w:tplc="04090001" w:tentative="1">
-      <w:start w:val="1"/>
-      <w:numFmt w:val="bullet"/>
-      <w:lvlText w:val=""/>
-      <w:lvlJc w:val="left"/>
-      <w:pPr>
-        <w:ind w:left="2880" w:hanging="360"/>
-      </w:pPr>
-      <w:rPr>
-        <w:rFonts w:ascii="Symbol" w:hAnsi="Symbol" w:hint="default"/>
-      </w:rPr>
-    </w:lvl>
-    <w:lvl w:ilvl="4" w:tplc="04090003" w:tentative="1">
-      <w:start w:val="1"/>
-      <w:numFmt w:val="bullet"/>
-      <w:lvlText w:val="o"/>
-      <w:lvlJc w:val="left"/>
-      <w:pPr>
-        <w:ind w:left="3600" w:hanging="360"/>
-      </w:pPr>
-      <w:rPr>
-        <w:rFonts w:ascii="Courier New" w:hAnsi="Courier New" w:cs="Courier New" w:hint="default"/>
-      </w:rPr>
-    </w:lvl>
-    <w:lvl w:ilvl="5" w:tplc="04090005" w:tentative="1">
-      <w:start w:val="1"/>
-      <w:numFmt w:val="bullet"/>
-      <w:lvlText w:val=""/>
-      <w:lvlJc w:val="left"/>
-      <w:pPr>
-        <w:ind w:left="4320" w:hanging="360"/>
-      </w:pPr>
-      <w:rPr>
-        <w:rFonts w:ascii="Wingdings" w:hAnsi="Wingdings" w:hint="default"/>
-      </w:rPr>
-    </w:lvl>
-    <w:lvl w:ilvl="6" w:tplc="04090001" w:tentative="1">
-      <w:start w:val="1"/>
-      <w:numFmt w:val="bullet"/>
-      <w:lvlText w:val=""/>
-      <w:lvlJc w:val="left"/>
-      <w:pPr>
-        <w:ind w:left="5040" w:hanging="360"/>
-      </w:pPr>
-      <w:rPr>
-        <w:rFonts w:ascii="Symbol" w:hAnsi="Symbol" w:hint="default"/>
-      </w:rPr>
-    </w:lvl>
-    <w:lvl w:ilvl="7" w:tplc="04090003" w:tentative="1">
-      <w:start w:val="1"/>
-      <w:numFmt w:val="bullet"/>
-      <w:lvlText w:val="o"/>
-      <w:lvlJc w:val="left"/>
-      <w:pPr>
-        <w:ind w:left="5760" w:hanging="360"/>
-      </w:pPr>
-      <w:rPr>
-        <w:rFonts w:ascii="Courier New" w:hAnsi="Courier New" w:cs="Courier New" w:hint="default"/>
-      </w:rPr>
-    </w:lvl>
-    <w:lvl w:ilvl="8" w:tplc="04090005" w:tentative="1">
-      <w:start w:val="1"/>
-      <w:numFmt w:val="bullet"/>
-      <w:lvlText w:val=""/>
-      <w:lvlJc w:val="left"/>
-      <w:pPr>
-        <w:ind w:left="6480" w:hanging="360"/>
-      </w:pPr>
-      <w:rPr>
-        <w:rFonts w:ascii="Wingdings" w:hAnsi="Wingdings" w:hint="default"/>
-      </w:rPr>
-    </w:lvl>
-  </w:abstractNum>
-  <w:abstractNum w:abstractNumId="17" w15:restartNumberingAfterBreak="0">
-    <w:nsid w:val="5A0B13C4"/>
-    <w:multiLevelType w:val="hybridMultilevel"/>
-    <w:tmpl w:val="E84E7C10"/>
-    <w:lvl w:ilvl="0" w:tplc="D3200AAE">
-      <w:start w:val="1"/>
-      <w:numFmt w:val="bullet"/>
-      <w:lvlText w:val=""/>
-      <w:lvlJc w:val="left"/>
-      <w:pPr>
-        <w:ind w:left="1440" w:hanging="360"/>
-      </w:pPr>
-      <w:rPr>
-        <w:rFonts w:ascii="Symbol" w:hAnsi="Symbol" w:hint="default"/>
-      </w:rPr>
-    </w:lvl>
-    <w:lvl w:ilvl="1" w:tplc="04090003">
-      <w:start w:val="1"/>
-      <w:numFmt w:val="bullet"/>
-      <w:lvlText w:val="o"/>
-      <w:lvlJc w:val="left"/>
-      <w:pPr>
-        <w:ind w:left="2160" w:hanging="360"/>
-      </w:pPr>
-      <w:rPr>
-        <w:rFonts w:ascii="Courier New" w:hAnsi="Courier New" w:cs="Courier New" w:hint="default"/>
-      </w:rPr>
-    </w:lvl>
-    <w:lvl w:ilvl="2" w:tplc="04090005" w:tentative="1">
-      <w:start w:val="1"/>
-      <w:numFmt w:val="bullet"/>
-      <w:lvlText w:val=""/>
-      <w:lvlJc w:val="left"/>
-      <w:pPr>
-        <w:ind w:left="2880" w:hanging="360"/>
-      </w:pPr>
-      <w:rPr>
-        <w:rFonts w:ascii="Wingdings" w:hAnsi="Wingdings" w:hint="default"/>
-      </w:rPr>
-    </w:lvl>
-    <w:lvl w:ilvl="3" w:tplc="04090001" w:tentative="1">
-      <w:start w:val="1"/>
-      <w:numFmt w:val="bullet"/>
-      <w:lvlText w:val=""/>
-      <w:lvlJc w:val="left"/>
-      <w:pPr>
-        <w:ind w:left="3600" w:hanging="360"/>
-      </w:pPr>
-      <w:rPr>
-        <w:rFonts w:ascii="Symbol" w:hAnsi="Symbol" w:hint="default"/>
-      </w:rPr>
-    </w:lvl>
-    <w:lvl w:ilvl="4" w:tplc="04090003" w:tentative="1">
-      <w:start w:val="1"/>
-      <w:numFmt w:val="bullet"/>
-      <w:lvlText w:val="o"/>
-      <w:lvlJc w:val="left"/>
-      <w:pPr>
-        <w:ind w:left="4320" w:hanging="360"/>
-      </w:pPr>
-      <w:rPr>
-        <w:rFonts w:ascii="Courier New" w:hAnsi="Courier New" w:cs="Courier New" w:hint="default"/>
-      </w:rPr>
-    </w:lvl>
-    <w:lvl w:ilvl="5" w:tplc="04090005" w:tentative="1">
-      <w:start w:val="1"/>
-      <w:numFmt w:val="bullet"/>
-      <w:lvlText w:val=""/>
-      <w:lvlJc w:val="left"/>
-      <w:pPr>
-        <w:ind w:left="5040" w:hanging="360"/>
-      </w:pPr>
-      <w:rPr>
-        <w:rFonts w:ascii="Wingdings" w:hAnsi="Wingdings" w:hint="default"/>
-      </w:rPr>
-    </w:lvl>
-    <w:lvl w:ilvl="6" w:tplc="04090001" w:tentative="1">
-      <w:start w:val="1"/>
-      <w:numFmt w:val="bullet"/>
-      <w:lvlText w:val=""/>
-      <w:lvlJc w:val="left"/>
-      <w:pPr>
-        <w:ind w:left="5760" w:hanging="360"/>
-      </w:pPr>
-      <w:rPr>
-        <w:rFonts w:ascii="Symbol" w:hAnsi="Symbol" w:hint="default"/>
-      </w:rPr>
-    </w:lvl>
-    <w:lvl w:ilvl="7" w:tplc="04090003" w:tentative="1">
-      <w:start w:val="1"/>
-      <w:numFmt w:val="bullet"/>
-      <w:lvlText w:val="o"/>
-      <w:lvlJc w:val="left"/>
-      <w:pPr>
-        <w:ind w:left="6480" w:hanging="360"/>
-      </w:pPr>
-      <w:rPr>
-        <w:rFonts w:ascii="Courier New" w:hAnsi="Courier New" w:cs="Courier New" w:hint="default"/>
-      </w:rPr>
-    </w:lvl>
-    <w:lvl w:ilvl="8" w:tplc="04090005" w:tentative="1">
-      <w:start w:val="1"/>
-      <w:numFmt w:val="bullet"/>
-      <w:lvlText w:val=""/>
-      <w:lvlJc w:val="left"/>
-      <w:pPr>
-        <w:ind w:left="7200" w:hanging="360"/>
-      </w:pPr>
-      <w:rPr>
-        <w:rFonts w:ascii="Wingdings" w:hAnsi="Wingdings" w:hint="default"/>
-      </w:rPr>
-    </w:lvl>
-  </w:abstractNum>
-  <w:abstractNum w:abstractNumId="18" w15:restartNumberingAfterBreak="0">
+  <w:abstractNum w:abstractNumId="9" w15:restartNumberingAfterBreak="0">
     <w:nsid w:val="611F1F7C"/>
     <w:multiLevelType w:val="hybridMultilevel"/>
     <w:tmpl w:val="10226E08"/>
@@ -2395,233 +2266,7 @@
       </w:rPr>
     </w:lvl>
   </w:abstractNum>
-  <w:abstractNum w:abstractNumId="19" w15:restartNumberingAfterBreak="0">
-    <w:nsid w:val="636B498A"/>
-    <w:multiLevelType w:val="hybridMultilevel"/>
-    <w:tmpl w:val="1032CF60"/>
-    <w:lvl w:ilvl="0" w:tplc="04090001">
-      <w:start w:val="1"/>
-      <w:numFmt w:val="bullet"/>
-      <w:lvlText w:val=""/>
-      <w:lvlJc w:val="left"/>
-      <w:pPr>
-        <w:ind w:left="720" w:hanging="360"/>
-      </w:pPr>
-      <w:rPr>
-        <w:rFonts w:ascii="Symbol" w:hAnsi="Symbol" w:hint="default"/>
-      </w:rPr>
-    </w:lvl>
-    <w:lvl w:ilvl="1" w:tplc="04090003" w:tentative="1">
-      <w:start w:val="1"/>
-      <w:numFmt w:val="bullet"/>
-      <w:lvlText w:val="o"/>
-      <w:lvlJc w:val="left"/>
-      <w:pPr>
-        <w:ind w:left="1440" w:hanging="360"/>
-      </w:pPr>
-      <w:rPr>
-        <w:rFonts w:ascii="Courier New" w:hAnsi="Courier New" w:cs="Courier New" w:hint="default"/>
-      </w:rPr>
-    </w:lvl>
-    <w:lvl w:ilvl="2" w:tplc="04090005" w:tentative="1">
-      <w:start w:val="1"/>
-      <w:numFmt w:val="bullet"/>
-      <w:lvlText w:val=""/>
-      <w:lvlJc w:val="left"/>
-      <w:pPr>
-        <w:ind w:left="2160" w:hanging="360"/>
-      </w:pPr>
-      <w:rPr>
-        <w:rFonts w:ascii="Wingdings" w:hAnsi="Wingdings" w:hint="default"/>
-      </w:rPr>
-    </w:lvl>
-    <w:lvl w:ilvl="3" w:tplc="04090001" w:tentative="1">
-      <w:start w:val="1"/>
-      <w:numFmt w:val="bullet"/>
-      <w:lvlText w:val=""/>
-      <w:lvlJc w:val="left"/>
-      <w:pPr>
-        <w:ind w:left="2880" w:hanging="360"/>
-      </w:pPr>
-      <w:rPr>
-        <w:rFonts w:ascii="Symbol" w:hAnsi="Symbol" w:hint="default"/>
-      </w:rPr>
-    </w:lvl>
-    <w:lvl w:ilvl="4" w:tplc="04090003" w:tentative="1">
-      <w:start w:val="1"/>
-      <w:numFmt w:val="bullet"/>
-      <w:lvlText w:val="o"/>
-      <w:lvlJc w:val="left"/>
-      <w:pPr>
-        <w:ind w:left="3600" w:hanging="360"/>
-      </w:pPr>
-      <w:rPr>
-        <w:rFonts w:ascii="Courier New" w:hAnsi="Courier New" w:cs="Courier New" w:hint="default"/>
-      </w:rPr>
-    </w:lvl>
-    <w:lvl w:ilvl="5" w:tplc="04090005" w:tentative="1">
-      <w:start w:val="1"/>
-      <w:numFmt w:val="bullet"/>
-      <w:lvlText w:val=""/>
-      <w:lvlJc w:val="left"/>
-      <w:pPr>
-        <w:ind w:left="4320" w:hanging="360"/>
-      </w:pPr>
-      <w:rPr>
-        <w:rFonts w:ascii="Wingdings" w:hAnsi="Wingdings" w:hint="default"/>
-      </w:rPr>
-    </w:lvl>
-    <w:lvl w:ilvl="6" w:tplc="04090001" w:tentative="1">
-      <w:start w:val="1"/>
-      <w:numFmt w:val="bullet"/>
-      <w:lvlText w:val=""/>
-      <w:lvlJc w:val="left"/>
-      <w:pPr>
-        <w:ind w:left="5040" w:hanging="360"/>
-      </w:pPr>
-      <w:rPr>
-        <w:rFonts w:ascii="Symbol" w:hAnsi="Symbol" w:hint="default"/>
-      </w:rPr>
-    </w:lvl>
-    <w:lvl w:ilvl="7" w:tplc="04090003" w:tentative="1">
-      <w:start w:val="1"/>
-      <w:numFmt w:val="bullet"/>
-      <w:lvlText w:val="o"/>
-      <w:lvlJc w:val="left"/>
-      <w:pPr>
-        <w:ind w:left="5760" w:hanging="360"/>
-      </w:pPr>
-      <w:rPr>
-        <w:rFonts w:ascii="Courier New" w:hAnsi="Courier New" w:cs="Courier New" w:hint="default"/>
-      </w:rPr>
-    </w:lvl>
-    <w:lvl w:ilvl="8" w:tplc="04090005" w:tentative="1">
-      <w:start w:val="1"/>
-      <w:numFmt w:val="bullet"/>
-      <w:lvlText w:val=""/>
-      <w:lvlJc w:val="left"/>
-      <w:pPr>
-        <w:ind w:left="6480" w:hanging="360"/>
-      </w:pPr>
-      <w:rPr>
-        <w:rFonts w:ascii="Wingdings" w:hAnsi="Wingdings" w:hint="default"/>
-      </w:rPr>
-    </w:lvl>
-  </w:abstractNum>
-  <w:abstractNum w:abstractNumId="20" w15:restartNumberingAfterBreak="0">
-    <w:nsid w:val="6774194D"/>
-    <w:multiLevelType w:val="hybridMultilevel"/>
-    <w:tmpl w:val="9CD2C286"/>
-    <w:lvl w:ilvl="0" w:tplc="04090001">
-      <w:start w:val="1"/>
-      <w:numFmt w:val="bullet"/>
-      <w:lvlText w:val=""/>
-      <w:lvlJc w:val="left"/>
-      <w:pPr>
-        <w:ind w:left="720" w:hanging="360"/>
-      </w:pPr>
-      <w:rPr>
-        <w:rFonts w:ascii="Symbol" w:hAnsi="Symbol" w:hint="default"/>
-      </w:rPr>
-    </w:lvl>
-    <w:lvl w:ilvl="1" w:tplc="04090003" w:tentative="1">
-      <w:start w:val="1"/>
-      <w:numFmt w:val="bullet"/>
-      <w:lvlText w:val="o"/>
-      <w:lvlJc w:val="left"/>
-      <w:pPr>
-        <w:ind w:left="1440" w:hanging="360"/>
-      </w:pPr>
-      <w:rPr>
-        <w:rFonts w:ascii="Courier New" w:hAnsi="Courier New" w:cs="Courier New" w:hint="default"/>
-      </w:rPr>
-    </w:lvl>
-    <w:lvl w:ilvl="2" w:tplc="04090005" w:tentative="1">
-      <w:start w:val="1"/>
-      <w:numFmt w:val="bullet"/>
-      <w:lvlText w:val=""/>
-      <w:lvlJc w:val="left"/>
-      <w:pPr>
-        <w:ind w:left="2160" w:hanging="360"/>
-      </w:pPr>
-      <w:rPr>
-        <w:rFonts w:ascii="Wingdings" w:hAnsi="Wingdings" w:hint="default"/>
-      </w:rPr>
-    </w:lvl>
-    <w:lvl w:ilvl="3" w:tplc="04090001" w:tentative="1">
-      <w:start w:val="1"/>
-      <w:numFmt w:val="bullet"/>
-      <w:lvlText w:val=""/>
-      <w:lvlJc w:val="left"/>
-      <w:pPr>
-        <w:ind w:left="2880" w:hanging="360"/>
-      </w:pPr>
-      <w:rPr>
-        <w:rFonts w:ascii="Symbol" w:hAnsi="Symbol" w:hint="default"/>
-      </w:rPr>
-    </w:lvl>
-    <w:lvl w:ilvl="4" w:tplc="04090003" w:tentative="1">
-      <w:start w:val="1"/>
-      <w:numFmt w:val="bullet"/>
-      <w:lvlText w:val="o"/>
-      <w:lvlJc w:val="left"/>
-      <w:pPr>
-        <w:ind w:left="3600" w:hanging="360"/>
-      </w:pPr>
-      <w:rPr>
-        <w:rFonts w:ascii="Courier New" w:hAnsi="Courier New" w:cs="Courier New" w:hint="default"/>
-      </w:rPr>
-    </w:lvl>
-    <w:lvl w:ilvl="5" w:tplc="04090005" w:tentative="1">
-      <w:start w:val="1"/>
-      <w:numFmt w:val="bullet"/>
-      <w:lvlText w:val=""/>
-      <w:lvlJc w:val="left"/>
-      <w:pPr>
-        <w:ind w:left="4320" w:hanging="360"/>
-      </w:pPr>
-      <w:rPr>
-        <w:rFonts w:ascii="Wingdings" w:hAnsi="Wingdings" w:hint="default"/>
-      </w:rPr>
-    </w:lvl>
-    <w:lvl w:ilvl="6" w:tplc="04090001" w:tentative="1">
-      <w:start w:val="1"/>
-      <w:numFmt w:val="bullet"/>
-      <w:lvlText w:val=""/>
-      <w:lvlJc w:val="left"/>
-      <w:pPr>
-        <w:ind w:left="5040" w:hanging="360"/>
-      </w:pPr>
-      <w:rPr>
-        <w:rFonts w:ascii="Symbol" w:hAnsi="Symbol" w:hint="default"/>
-      </w:rPr>
-    </w:lvl>
-    <w:lvl w:ilvl="7" w:tplc="04090003" w:tentative="1">
-      <w:start w:val="1"/>
-      <w:numFmt w:val="bullet"/>
-      <w:lvlText w:val="o"/>
-      <w:lvlJc w:val="left"/>
-      <w:pPr>
-        <w:ind w:left="5760" w:hanging="360"/>
-      </w:pPr>
-      <w:rPr>
-        <w:rFonts w:ascii="Courier New" w:hAnsi="Courier New" w:cs="Courier New" w:hint="default"/>
-      </w:rPr>
-    </w:lvl>
-    <w:lvl w:ilvl="8" w:tplc="04090005" w:tentative="1">
-      <w:start w:val="1"/>
-      <w:numFmt w:val="bullet"/>
-      <w:lvlText w:val=""/>
-      <w:lvlJc w:val="left"/>
-      <w:pPr>
-        <w:ind w:left="6480" w:hanging="360"/>
-      </w:pPr>
-      <w:rPr>
-        <w:rFonts w:ascii="Wingdings" w:hAnsi="Wingdings" w:hint="default"/>
-      </w:rPr>
-    </w:lvl>
-  </w:abstractNum>
-  <w:abstractNum w:abstractNumId="21" w15:restartNumberingAfterBreak="0">
+  <w:abstractNum w:abstractNumId="10" w15:restartNumberingAfterBreak="0">
     <w:nsid w:val="6B961852"/>
     <w:multiLevelType w:val="hybridMultilevel"/>
     <w:tmpl w:val="DAAECE10"/>
@@ -2714,410 +2359,46 @@
       </w:pPr>
     </w:lvl>
   </w:abstractNum>
-  <w:abstractNum w:abstractNumId="22" w15:restartNumberingAfterBreak="0">
-    <w:nsid w:val="7BAF36E9"/>
-    <w:multiLevelType w:val="multilevel"/>
-    <w:tmpl w:val="24180D92"/>
-    <w:lvl w:ilvl="0">
-      <w:start w:val="1"/>
-      <w:numFmt w:val="bullet"/>
-      <w:lvlText w:val=""/>
-      <w:lvlJc w:val="left"/>
-      <w:pPr>
-        <w:tabs>
-          <w:tab w:val="num" w:pos="504"/>
-        </w:tabs>
-        <w:ind w:left="504" w:hanging="504"/>
-      </w:pPr>
-      <w:rPr>
-        <w:rFonts w:ascii="Symbol" w:hAnsi="Symbol" w:hint="default"/>
-        <w:color w:val="000000" w:themeColor="text1"/>
-      </w:rPr>
-    </w:lvl>
-    <w:lvl w:ilvl="1">
-      <w:start w:val="1"/>
-      <w:numFmt w:val="bullet"/>
-      <w:lvlText w:val="o"/>
-      <w:lvlJc w:val="left"/>
-      <w:pPr>
-        <w:tabs>
-          <w:tab w:val="num" w:pos="720"/>
-        </w:tabs>
-        <w:ind w:left="720" w:hanging="360"/>
-      </w:pPr>
-      <w:rPr>
-        <w:rFonts w:ascii="Courier New" w:hAnsi="Courier New" w:cs="Courier New" w:hint="default"/>
-      </w:rPr>
-    </w:lvl>
-    <w:lvl w:ilvl="2">
-      <w:start w:val="1"/>
-      <w:numFmt w:val="bullet"/>
-      <w:lvlText w:val=""/>
-      <w:lvlJc w:val="left"/>
-      <w:pPr>
-        <w:tabs>
-          <w:tab w:val="num" w:pos="1080"/>
-        </w:tabs>
-        <w:ind w:left="1080" w:hanging="360"/>
-      </w:pPr>
-      <w:rPr>
-        <w:rFonts w:ascii="Wingdings" w:hAnsi="Wingdings" w:cs="Wingdings" w:hint="default"/>
-      </w:rPr>
-    </w:lvl>
-    <w:lvl w:ilvl="3">
-      <w:start w:val="1"/>
-      <w:numFmt w:val="bullet"/>
-      <w:lvlText w:val=""/>
-      <w:lvlJc w:val="left"/>
-      <w:pPr>
-        <w:tabs>
-          <w:tab w:val="num" w:pos="1440"/>
-        </w:tabs>
-        <w:ind w:left="1440" w:hanging="360"/>
-      </w:pPr>
-      <w:rPr>
-        <w:rFonts w:ascii="Symbol" w:hAnsi="Symbol" w:cs="Symbol" w:hint="default"/>
-      </w:rPr>
-    </w:lvl>
-    <w:lvl w:ilvl="4">
-      <w:start w:val="1"/>
-      <w:numFmt w:val="bullet"/>
-      <w:lvlText w:val="o"/>
-      <w:lvlJc w:val="left"/>
-      <w:pPr>
-        <w:tabs>
-          <w:tab w:val="num" w:pos="1800"/>
-        </w:tabs>
-        <w:ind w:left="1800" w:hanging="360"/>
-      </w:pPr>
-      <w:rPr>
-        <w:rFonts w:ascii="Courier New" w:hAnsi="Courier New" w:cs="Courier New" w:hint="default"/>
-      </w:rPr>
-    </w:lvl>
-    <w:lvl w:ilvl="5">
-      <w:start w:val="1"/>
-      <w:numFmt w:val="bullet"/>
-      <w:lvlText w:val=""/>
-      <w:lvlJc w:val="left"/>
-      <w:pPr>
-        <w:tabs>
-          <w:tab w:val="num" w:pos="2160"/>
-        </w:tabs>
-        <w:ind w:left="2160" w:hanging="360"/>
-      </w:pPr>
-      <w:rPr>
-        <w:rFonts w:ascii="Wingdings" w:hAnsi="Wingdings" w:cs="Wingdings" w:hint="default"/>
-      </w:rPr>
-    </w:lvl>
-    <w:lvl w:ilvl="6">
-      <w:start w:val="1"/>
-      <w:numFmt w:val="bullet"/>
-      <w:lvlText w:val=""/>
-      <w:lvlJc w:val="left"/>
-      <w:pPr>
-        <w:tabs>
-          <w:tab w:val="num" w:pos="2520"/>
-        </w:tabs>
-        <w:ind w:left="2520" w:hanging="360"/>
-      </w:pPr>
-      <w:rPr>
-        <w:rFonts w:ascii="Symbol" w:hAnsi="Symbol" w:cs="Symbol" w:hint="default"/>
-      </w:rPr>
-    </w:lvl>
-    <w:lvl w:ilvl="7">
-      <w:start w:val="1"/>
-      <w:numFmt w:val="bullet"/>
-      <w:lvlText w:val="o"/>
-      <w:lvlJc w:val="left"/>
-      <w:pPr>
-        <w:tabs>
-          <w:tab w:val="num" w:pos="2880"/>
-        </w:tabs>
-        <w:ind w:left="2880" w:hanging="360"/>
-      </w:pPr>
-      <w:rPr>
-        <w:rFonts w:ascii="Courier New" w:hAnsi="Courier New" w:cs="Courier New" w:hint="default"/>
-      </w:rPr>
-    </w:lvl>
-    <w:lvl w:ilvl="8">
-      <w:start w:val="1"/>
-      <w:numFmt w:val="bullet"/>
-      <w:lvlText w:val=""/>
-      <w:lvlJc w:val="left"/>
-      <w:pPr>
-        <w:tabs>
-          <w:tab w:val="num" w:pos="3240"/>
-        </w:tabs>
-        <w:ind w:left="3240" w:hanging="360"/>
-      </w:pPr>
-      <w:rPr>
-        <w:rFonts w:ascii="Wingdings" w:hAnsi="Wingdings" w:cs="Wingdings" w:hint="default"/>
-      </w:rPr>
-    </w:lvl>
-  </w:abstractNum>
-  <w:abstractNum w:abstractNumId="23" w15:restartNumberingAfterBreak="0">
-    <w:nsid w:val="7C814507"/>
-    <w:multiLevelType w:val="hybridMultilevel"/>
-    <w:tmpl w:val="DFB0FCA2"/>
-    <w:lvl w:ilvl="0" w:tplc="04090001">
-      <w:start w:val="1"/>
-      <w:numFmt w:val="bullet"/>
-      <w:lvlText w:val=""/>
-      <w:lvlJc w:val="left"/>
-      <w:pPr>
-        <w:ind w:left="720" w:hanging="360"/>
-      </w:pPr>
-      <w:rPr>
-        <w:rFonts w:ascii="Symbol" w:hAnsi="Symbol" w:hint="default"/>
-      </w:rPr>
-    </w:lvl>
-    <w:lvl w:ilvl="1" w:tplc="04090003" w:tentative="1">
-      <w:start w:val="1"/>
-      <w:numFmt w:val="bullet"/>
-      <w:lvlText w:val="o"/>
-      <w:lvlJc w:val="left"/>
-      <w:pPr>
-        <w:ind w:left="1440" w:hanging="360"/>
-      </w:pPr>
-      <w:rPr>
-        <w:rFonts w:ascii="Courier New" w:hAnsi="Courier New" w:cs="Courier New" w:hint="default"/>
-      </w:rPr>
-    </w:lvl>
-    <w:lvl w:ilvl="2" w:tplc="04090005" w:tentative="1">
-      <w:start w:val="1"/>
-      <w:numFmt w:val="bullet"/>
-      <w:lvlText w:val=""/>
-      <w:lvlJc w:val="left"/>
-      <w:pPr>
-        <w:ind w:left="2160" w:hanging="360"/>
-      </w:pPr>
-      <w:rPr>
-        <w:rFonts w:ascii="Wingdings" w:hAnsi="Wingdings" w:hint="default"/>
-      </w:rPr>
-    </w:lvl>
-    <w:lvl w:ilvl="3" w:tplc="04090001" w:tentative="1">
-      <w:start w:val="1"/>
-      <w:numFmt w:val="bullet"/>
-      <w:lvlText w:val=""/>
-      <w:lvlJc w:val="left"/>
-      <w:pPr>
-        <w:ind w:left="2880" w:hanging="360"/>
-      </w:pPr>
-      <w:rPr>
-        <w:rFonts w:ascii="Symbol" w:hAnsi="Symbol" w:hint="default"/>
-      </w:rPr>
-    </w:lvl>
-    <w:lvl w:ilvl="4" w:tplc="04090003" w:tentative="1">
-      <w:start w:val="1"/>
-      <w:numFmt w:val="bullet"/>
-      <w:lvlText w:val="o"/>
-      <w:lvlJc w:val="left"/>
-      <w:pPr>
-        <w:ind w:left="3600" w:hanging="360"/>
-      </w:pPr>
-      <w:rPr>
-        <w:rFonts w:ascii="Courier New" w:hAnsi="Courier New" w:cs="Courier New" w:hint="default"/>
-      </w:rPr>
-    </w:lvl>
-    <w:lvl w:ilvl="5" w:tplc="04090005" w:tentative="1">
-      <w:start w:val="1"/>
-      <w:numFmt w:val="bullet"/>
-      <w:lvlText w:val=""/>
-      <w:lvlJc w:val="left"/>
-      <w:pPr>
-        <w:ind w:left="4320" w:hanging="360"/>
-      </w:pPr>
-      <w:rPr>
-        <w:rFonts w:ascii="Wingdings" w:hAnsi="Wingdings" w:hint="default"/>
-      </w:rPr>
-    </w:lvl>
-    <w:lvl w:ilvl="6" w:tplc="04090001" w:tentative="1">
-      <w:start w:val="1"/>
-      <w:numFmt w:val="bullet"/>
-      <w:lvlText w:val=""/>
-      <w:lvlJc w:val="left"/>
-      <w:pPr>
-        <w:ind w:left="5040" w:hanging="360"/>
-      </w:pPr>
-      <w:rPr>
-        <w:rFonts w:ascii="Symbol" w:hAnsi="Symbol" w:hint="default"/>
-      </w:rPr>
-    </w:lvl>
-    <w:lvl w:ilvl="7" w:tplc="04090003" w:tentative="1">
-      <w:start w:val="1"/>
-      <w:numFmt w:val="bullet"/>
-      <w:lvlText w:val="o"/>
-      <w:lvlJc w:val="left"/>
-      <w:pPr>
-        <w:ind w:left="5760" w:hanging="360"/>
-      </w:pPr>
-      <w:rPr>
-        <w:rFonts w:ascii="Courier New" w:hAnsi="Courier New" w:cs="Courier New" w:hint="default"/>
-      </w:rPr>
-    </w:lvl>
-    <w:lvl w:ilvl="8" w:tplc="04090005" w:tentative="1">
-      <w:start w:val="1"/>
-      <w:numFmt w:val="bullet"/>
-      <w:lvlText w:val=""/>
-      <w:lvlJc w:val="left"/>
-      <w:pPr>
-        <w:ind w:left="6480" w:hanging="360"/>
-      </w:pPr>
-      <w:rPr>
-        <w:rFonts w:ascii="Wingdings" w:hAnsi="Wingdings" w:hint="default"/>
-      </w:rPr>
-    </w:lvl>
-  </w:abstractNum>
   <w:num w:numId="1">
-    <w:abstractNumId w:val="17"/>
+    <w:abstractNumId w:val="6"/>
   </w:num>
   <w:num w:numId="2">
-    <w:abstractNumId w:val="17"/>
+    <w:abstractNumId w:val="4"/>
   </w:num>
   <w:num w:numId="3">
-    <w:abstractNumId w:val="17"/>
+    <w:abstractNumId w:val="5"/>
   </w:num>
   <w:num w:numId="4">
+    <w:abstractNumId w:val="2"/>
+  </w:num>
+  <w:num w:numId="5">
+    <w:abstractNumId w:val="10"/>
+  </w:num>
+  <w:num w:numId="6">
+    <w:abstractNumId w:val="8"/>
+  </w:num>
+  <w:num w:numId="7">
+    <w:abstractNumId w:val="7"/>
+  </w:num>
+  <w:num w:numId="8">
+    <w:abstractNumId w:val="0"/>
+  </w:num>
+  <w:num w:numId="9">
     <w:abstractNumId w:val="6"/>
   </w:num>
-  <w:num w:numId="5">
+  <w:num w:numId="10">
+    <w:abstractNumId w:val="1"/>
+  </w:num>
+  <w:num w:numId="11">
     <w:abstractNumId w:val="3"/>
   </w:num>
-  <w:num w:numId="6">
-    <w:abstractNumId w:val="5"/>
-  </w:num>
-  <w:num w:numId="7">
-    <w:abstractNumId w:val="11"/>
-  </w:num>
-  <w:num w:numId="8">
-    <w:abstractNumId w:val="11"/>
-  </w:num>
-  <w:num w:numId="9">
-    <w:abstractNumId w:val="11"/>
-  </w:num>
-  <w:num w:numId="10">
-    <w:abstractNumId w:val="3"/>
-  </w:num>
-  <w:num w:numId="11">
-    <w:abstractNumId w:val="10"/>
-  </w:num>
   <w:num w:numId="12">
-    <w:abstractNumId w:val="4"/>
+    <w:abstractNumId w:val="9"/>
   </w:num>
   <w:num w:numId="13">
-    <w:abstractNumId w:val="21"/>
-  </w:num>
-  <w:num w:numId="14">
-    <w:abstractNumId w:val="15"/>
-  </w:num>
-  <w:num w:numId="15">
-    <w:abstractNumId w:val="14"/>
-  </w:num>
-  <w:num w:numId="16">
-    <w:abstractNumId w:val="1"/>
-  </w:num>
-  <w:num w:numId="17">
-    <w:abstractNumId w:val="8"/>
-  </w:num>
-  <w:num w:numId="18">
-    <w:abstractNumId w:val="11"/>
-  </w:num>
-  <w:num w:numId="19">
-    <w:abstractNumId w:val="10"/>
-  </w:num>
-  <w:num w:numId="20">
-    <w:abstractNumId w:val="4"/>
-  </w:num>
-  <w:num w:numId="21">
-    <w:abstractNumId w:val="21"/>
-  </w:num>
-  <w:num w:numId="22">
-    <w:abstractNumId w:val="15"/>
-  </w:num>
-  <w:num w:numId="23">
-    <w:abstractNumId w:val="14"/>
-  </w:num>
-  <w:num w:numId="24">
-    <w:abstractNumId w:val="1"/>
-  </w:num>
-  <w:num w:numId="25">
-    <w:abstractNumId w:val="3"/>
-  </w:num>
-  <w:num w:numId="26">
-    <w:abstractNumId w:val="8"/>
-  </w:num>
-  <w:num w:numId="27">
     <w:abstractNumId w:val="6"/>
   </w:num>
-  <w:num w:numId="28">
-    <w:abstractNumId w:val="4"/>
-  </w:num>
-  <w:num w:numId="29">
-    <w:abstractNumId w:val="21"/>
-  </w:num>
-  <w:num w:numId="30">
-    <w:abstractNumId w:val="11"/>
-  </w:num>
-  <w:num w:numId="31">
-    <w:abstractNumId w:val="15"/>
-  </w:num>
-  <w:num w:numId="32">
-    <w:abstractNumId w:val="14"/>
-  </w:num>
-  <w:num w:numId="33">
-    <w:abstractNumId w:val="1"/>
-  </w:num>
-  <w:num w:numId="34">
-    <w:abstractNumId w:val="11"/>
-  </w:num>
-  <w:num w:numId="35">
-    <w:abstractNumId w:val="11"/>
-  </w:num>
-  <w:num w:numId="36">
-    <w:abstractNumId w:val="3"/>
-  </w:num>
-  <w:num w:numId="37">
-    <w:abstractNumId w:val="8"/>
-  </w:num>
-  <w:num w:numId="38">
-    <w:abstractNumId w:val="6"/>
-  </w:num>
-  <w:num w:numId="39">
-    <w:abstractNumId w:val="13"/>
-  </w:num>
-  <w:num w:numId="40">
-    <w:abstractNumId w:val="19"/>
-  </w:num>
-  <w:num w:numId="41">
-    <w:abstractNumId w:val="22"/>
-  </w:num>
-  <w:num w:numId="42">
-    <w:abstractNumId w:val="16"/>
-  </w:num>
-  <w:num w:numId="43">
-    <w:abstractNumId w:val="2"/>
-  </w:num>
-  <w:num w:numId="44">
-    <w:abstractNumId w:val="20"/>
-  </w:num>
-  <w:num w:numId="45">
-    <w:abstractNumId w:val="12"/>
-  </w:num>
-  <w:num w:numId="46">
-    <w:abstractNumId w:val="0"/>
-  </w:num>
-  <w:num w:numId="47">
-    <w:abstractNumId w:val="18"/>
-  </w:num>
-  <w:num w:numId="48">
-    <w:abstractNumId w:val="7"/>
-  </w:num>
-  <w:num w:numId="49">
-    <w:abstractNumId w:val="23"/>
-  </w:num>
-  <w:num w:numId="50">
-    <w:abstractNumId w:val="9"/>
-  </w:num>
+  <w:numIdMacAtCleanup w:val="11"/>
 </w:numbering>
 </file>
 
@@ -3729,7 +3010,7 @@
     <w:pPr>
       <w:widowControl w:val="0"/>
       <w:numPr>
-        <w:numId w:val="35"/>
+        <w:numId w:val="9"/>
       </w:numPr>
       <w:autoSpaceDE w:val="0"/>
       <w:autoSpaceDN w:val="0"/>
@@ -3751,7 +3032,7 @@
     <w:rsid w:val="000F4FEF"/>
     <w:pPr>
       <w:numPr>
-        <w:numId w:val="38"/>
+        <w:numId w:val="11"/>
       </w:numPr>
     </w:pPr>
   </w:style>
@@ -3948,7 +3229,7 @@
     <w:rsid w:val="000F4FEF"/>
     <w:pPr>
       <w:numPr>
-        <w:numId w:val="36"/>
+        <w:numId w:val="10"/>
       </w:numPr>
     </w:pPr>
     <w:rPr>
@@ -4126,7 +3407,7 @@
     <w:pPr>
       <w:numPr>
         <w:ilvl w:val="1"/>
-        <w:numId w:val="19"/>
+        <w:numId w:val="3"/>
       </w:numPr>
     </w:pPr>
   </w:style>
@@ -4171,7 +3452,7 @@
     <w:pPr>
       <w:widowControl w:val="0"/>
       <w:numPr>
-        <w:numId w:val="28"/>
+        <w:numId w:val="4"/>
       </w:numPr>
       <w:suppressAutoHyphens/>
       <w:autoSpaceDE w:val="0"/>
@@ -4195,7 +3476,7 @@
     <w:rsid w:val="000F4FEF"/>
     <w:pPr>
       <w:numPr>
-        <w:numId w:val="29"/>
+        <w:numId w:val="5"/>
       </w:numPr>
       <w:outlineLvl w:val="9"/>
     </w:pPr>
@@ -4242,7 +3523,7 @@
     <w:rsid w:val="000F4FEF"/>
     <w:pPr>
       <w:numPr>
-        <w:numId w:val="31"/>
+        <w:numId w:val="6"/>
       </w:numPr>
       <w:pBdr>
         <w:top w:val="single" w:sz="12" w:space="1" w:color="0070C0"/>
@@ -4370,7 +3651,7 @@
     <w:rsid w:val="000F4FEF"/>
     <w:pPr>
       <w:numPr>
-        <w:numId w:val="32"/>
+        <w:numId w:val="7"/>
       </w:numPr>
       <w:pBdr>
         <w:top w:val="single" w:sz="12" w:space="1" w:color="0070C0"/>
@@ -4408,7 +3689,7 @@
       <w:widowControl w:val="0"/>
       <w:numPr>
         <w:ilvl w:val="4"/>
-        <w:numId w:val="33"/>
+        <w:numId w:val="8"/>
       </w:numPr>
       <w:autoSpaceDE w:val="0"/>
       <w:autoSpaceDN w:val="0"/>
@@ -4488,7 +3769,7 @@
     <w:rsid w:val="000F4FEF"/>
     <w:pPr>
       <w:numPr>
-        <w:numId w:val="17"/>
+        <w:numId w:val="2"/>
       </w:numPr>
     </w:pPr>
   </w:style>
@@ -5091,6 +4372,127 @@
         <w:insideV w:val="single" w:sz="4" w:space="0" w:color="BFBFBF" w:themeColor="background1" w:themeShade="BF"/>
       </w:tblBorders>
     </w:tblPr>
+  </w:style>
+  <w:style w:type="character" w:customStyle="1" w:styleId="UnresolvedMention1">
+    <w:name w:val="Unresolved Mention1"/>
+    <w:basedOn w:val="DefaultParagraphFont"/>
+    <w:uiPriority w:val="99"/>
+    <w:semiHidden/>
+    <w:unhideWhenUsed/>
+    <w:rsid w:val="00062938"/>
+    <w:rPr>
+      <w:color w:val="605E5C"/>
+      <w:shd w:val="clear" w:color="auto" w:fill="E1DFDD"/>
+    </w:rPr>
+  </w:style>
+  <w:style w:type="character" w:customStyle="1" w:styleId="UnresolvedMention2">
+    <w:name w:val="Unresolved Mention2"/>
+    <w:basedOn w:val="DefaultParagraphFont"/>
+    <w:uiPriority w:val="99"/>
+    <w:semiHidden/>
+    <w:unhideWhenUsed/>
+    <w:rsid w:val="00062938"/>
+    <w:rPr>
+      <w:color w:val="605E5C"/>
+      <w:shd w:val="clear" w:color="auto" w:fill="E1DFDD"/>
+    </w:rPr>
+  </w:style>
+  <w:style w:type="character" w:customStyle="1" w:styleId="UnresolvedMention3">
+    <w:name w:val="Unresolved Mention3"/>
+    <w:basedOn w:val="DefaultParagraphFont"/>
+    <w:uiPriority w:val="99"/>
+    <w:semiHidden/>
+    <w:unhideWhenUsed/>
+    <w:rsid w:val="00062938"/>
+    <w:rPr>
+      <w:color w:val="605E5C"/>
+      <w:shd w:val="clear" w:color="auto" w:fill="E1DFDD"/>
+    </w:rPr>
+  </w:style>
+  <w:style w:type="paragraph" w:styleId="Revision">
+    <w:name w:val="Revision"/>
+    <w:hidden/>
+    <w:uiPriority w:val="99"/>
+    <w:semiHidden/>
+    <w:rsid w:val="00062938"/>
+    <w:pPr>
+      <w:spacing w:beforeAutospacing="0" w:after="0" w:afterAutospacing="0" w:line="240" w:lineRule="auto"/>
+    </w:pPr>
+    <w:rPr>
+      <w:rFonts w:ascii="Arial" w:hAnsi="Arial" w:cs="Arial"/>
+    </w:rPr>
+  </w:style>
+  <w:style w:type="character" w:customStyle="1" w:styleId="UnresolvedMention4">
+    <w:name w:val="Unresolved Mention4"/>
+    <w:basedOn w:val="DefaultParagraphFont"/>
+    <w:uiPriority w:val="99"/>
+    <w:semiHidden/>
+    <w:unhideWhenUsed/>
+    <w:rsid w:val="00062938"/>
+    <w:rPr>
+      <w:color w:val="605E5C"/>
+      <w:shd w:val="clear" w:color="auto" w:fill="E1DFDD"/>
+    </w:rPr>
+  </w:style>
+  <w:style w:type="character" w:customStyle="1" w:styleId="UnresolvedMention31">
+    <w:name w:val="Unresolved Mention31"/>
+    <w:basedOn w:val="DefaultParagraphFont"/>
+    <w:uiPriority w:val="99"/>
+    <w:semiHidden/>
+    <w:unhideWhenUsed/>
+    <w:rsid w:val="00062938"/>
+    <w:rPr>
+      <w:color w:val="605E5C"/>
+      <w:shd w:val="clear" w:color="auto" w:fill="E1DFDD"/>
+    </w:rPr>
+  </w:style>
+  <w:style w:type="character" w:customStyle="1" w:styleId="UnresolvedMention5">
+    <w:name w:val="Unresolved Mention5"/>
+    <w:basedOn w:val="DefaultParagraphFont"/>
+    <w:uiPriority w:val="99"/>
+    <w:semiHidden/>
+    <w:unhideWhenUsed/>
+    <w:rsid w:val="00062938"/>
+    <w:rPr>
+      <w:color w:val="605E5C"/>
+      <w:shd w:val="clear" w:color="auto" w:fill="E1DFDD"/>
+    </w:rPr>
+  </w:style>
+  <w:style w:type="character" w:customStyle="1" w:styleId="UnresolvedMention6">
+    <w:name w:val="Unresolved Mention6"/>
+    <w:basedOn w:val="DefaultParagraphFont"/>
+    <w:uiPriority w:val="99"/>
+    <w:semiHidden/>
+    <w:unhideWhenUsed/>
+    <w:rsid w:val="00062938"/>
+    <w:rPr>
+      <w:color w:val="605E5C"/>
+      <w:shd w:val="clear" w:color="auto" w:fill="E1DFDD"/>
+    </w:rPr>
+  </w:style>
+  <w:style w:type="character" w:customStyle="1" w:styleId="UnresolvedMention7">
+    <w:name w:val="Unresolved Mention7"/>
+    <w:basedOn w:val="DefaultParagraphFont"/>
+    <w:uiPriority w:val="99"/>
+    <w:semiHidden/>
+    <w:unhideWhenUsed/>
+    <w:rsid w:val="00062938"/>
+    <w:rPr>
+      <w:color w:val="605E5C"/>
+      <w:shd w:val="clear" w:color="auto" w:fill="E1DFDD"/>
+    </w:rPr>
+  </w:style>
+  <w:style w:type="character" w:customStyle="1" w:styleId="UnresolvedMention8">
+    <w:name w:val="Unresolved Mention8"/>
+    <w:basedOn w:val="DefaultParagraphFont"/>
+    <w:uiPriority w:val="99"/>
+    <w:semiHidden/>
+    <w:unhideWhenUsed/>
+    <w:rsid w:val="00062938"/>
+    <w:rPr>
+      <w:color w:val="605E5C"/>
+      <w:shd w:val="clear" w:color="auto" w:fill="E1DFDD"/>
+    </w:rPr>
   </w:style>
 </w:styles>
 </file>
@@ -5388,4 +4790,16 @@
     </a:ext>
   </a:extLst>
 </a:theme>
+</file>
+
+<file path=customXml/item1.xml><?xml version="1.0" encoding="utf-8"?>
+<b:Sources xmlns:b="http://schemas.openxmlformats.org/officeDocument/2006/bibliography" xmlns="http://schemas.openxmlformats.org/officeDocument/2006/bibliography" SelectedStyle="\APASixthEditionOfficeOnline.xsl" StyleName="APA" Version="6"/>
+</file>
+
+<file path=customXml/itemProps1.xml><?xml version="1.0" encoding="utf-8"?>
+<ds:datastoreItem xmlns:ds="http://schemas.openxmlformats.org/officeDocument/2006/customXml" ds:itemID="{36285EEE-6041-426B-8EA9-D73E12EF4169}">
+  <ds:schemaRefs>
+    <ds:schemaRef ds:uri="http://schemas.openxmlformats.org/officeDocument/2006/bibliography"/>
+  </ds:schemaRefs>
+</ds:datastoreItem>
 </file>
</xml_diff>